<commit_message>
ansible - installation&configuration updated
</commit_message>
<xml_diff>
--- a/Ansible/2-installation&configuration.docx
+++ b/Ansible/2-installation&configuration.docx
@@ -74,58 +74,7 @@
     </w:p>
     <w:p>
       <w:pPr>
-        <w:spacing w:after="120"/>
-        <w:jc w:val="both"/>
-        <w:rPr>
-          <w:rFonts w:asciiTheme="majorBidi" w:hAnsiTheme="majorBidi" w:cstheme="majorBidi"/>
-          <w:sz w:val="28"/>
-          <w:szCs w:val="28"/>
-        </w:rPr>
-      </w:pPr>
-      <w:r>
-        <w:rPr>
-          <w:rFonts w:asciiTheme="majorBidi" w:hAnsiTheme="majorBidi" w:cstheme="majorBidi"/>
-          <w:sz w:val="28"/>
-          <w:szCs w:val="28"/>
-        </w:rPr>
-        <w:t>A senior engineer never leaves this to the “system defaults.” We explicitly define this file in the project root to guarantee that everyone on the team</w:t>
-      </w:r>
-      <w:r>
-        <w:rPr>
-          <w:rFonts w:asciiTheme="majorBidi" w:hAnsiTheme="majorBidi" w:cstheme="majorBidi"/>
-          <w:sz w:val="28"/>
-          <w:szCs w:val="28"/>
-        </w:rPr>
-        <w:t xml:space="preserve"> </w:t>
-      </w:r>
-      <w:r>
-        <w:rPr>
-          <w:rFonts w:asciiTheme="majorBidi" w:hAnsiTheme="majorBidi" w:cstheme="majorBidi"/>
-          <w:sz w:val="28"/>
-          <w:szCs w:val="28"/>
-        </w:rPr>
-        <w:t>and every CI/CD runner</w:t>
-      </w:r>
-      <w:r>
-        <w:rPr>
-          <w:rFonts w:asciiTheme="majorBidi" w:hAnsiTheme="majorBidi" w:cstheme="majorBidi"/>
-          <w:sz w:val="28"/>
-          <w:szCs w:val="28"/>
-        </w:rPr>
-        <w:t xml:space="preserve"> </w:t>
-      </w:r>
-      <w:r>
-        <w:rPr>
-          <w:rFonts w:asciiTheme="majorBidi" w:hAnsiTheme="majorBidi" w:cstheme="majorBidi"/>
-          <w:sz w:val="28"/>
-          <w:szCs w:val="28"/>
-        </w:rPr>
-        <w:t>executes the playbook in the exact same environment.</w:t>
-      </w:r>
-    </w:p>
-    <w:p>
-      <w:pPr>
-        <w:spacing w:after="100"/>
+        <w:spacing w:after="80"/>
         <w:jc w:val="both"/>
         <w:rPr>
           <w:rFonts w:asciiTheme="majorBidi" w:hAnsiTheme="majorBidi" w:cstheme="majorBidi"/>
@@ -404,7 +353,7 @@
     </w:p>
     <w:p>
       <w:pPr>
-        <w:spacing w:after="120"/>
+        <w:spacing w:after="100"/>
         <w:jc w:val="both"/>
         <w:rPr>
           <w:rFonts w:asciiTheme="majorBidi" w:hAnsiTheme="majorBidi" w:cstheme="majorBidi"/>
@@ -456,6 +405,7 @@
     <w:p>
       <w:pPr>
         <w:spacing w:after="80"/>
+        <w:jc w:val="both"/>
         <w:rPr>
           <w:rFonts w:asciiTheme="majorBidi" w:hAnsiTheme="majorBidi" w:cstheme="majorBidi"/>
           <w:b/>
@@ -484,6 +434,7 @@
         </w:numPr>
         <w:spacing w:after="80"/>
         <w:ind w:left="360"/>
+        <w:jc w:val="both"/>
         <w:rPr>
           <w:rFonts w:asciiTheme="majorBidi" w:hAnsiTheme="majorBidi" w:cstheme="majorBidi"/>
           <w:b/>
@@ -511,6 +462,7 @@
       <w:pPr>
         <w:spacing w:after="60"/>
         <w:ind w:left="360"/>
+        <w:jc w:val="both"/>
         <w:rPr>
           <w:rFonts w:asciiTheme="majorBidi" w:hAnsiTheme="majorBidi" w:cstheme="majorBidi"/>
           <w:sz w:val="28"/>
@@ -534,6 +486,7 @@
           <w:numId w:val="3"/>
         </w:numPr>
         <w:spacing w:after="0"/>
+        <w:jc w:val="both"/>
         <w:rPr>
           <w:rFonts w:asciiTheme="majorBidi" w:hAnsiTheme="majorBidi" w:cstheme="majorBidi"/>
           <w:sz w:val="28"/>
@@ -581,6 +534,7 @@
       <w:pPr>
         <w:spacing w:after="40"/>
         <w:ind w:left="720"/>
+        <w:jc w:val="both"/>
         <w:rPr>
           <w:rFonts w:asciiTheme="majorBidi" w:hAnsiTheme="majorBidi" w:cstheme="majorBidi"/>
           <w:sz w:val="28"/>
@@ -701,6 +655,7 @@
           <w:ilvl w:val="0"/>
           <w:numId w:val="3"/>
         </w:numPr>
+        <w:jc w:val="both"/>
         <w:rPr>
           <w:rFonts w:asciiTheme="majorBidi" w:hAnsiTheme="majorBidi" w:cstheme="majorBidi"/>
           <w:sz w:val="28"/>
@@ -773,6 +728,7 @@
           <w:ilvl w:val="0"/>
           <w:numId w:val="3"/>
         </w:numPr>
+        <w:jc w:val="both"/>
         <w:rPr>
           <w:rFonts w:asciiTheme="majorBidi" w:hAnsiTheme="majorBidi" w:cstheme="majorBidi"/>
           <w:sz w:val="28"/>
@@ -847,6 +803,7 @@
           <w:ilvl w:val="0"/>
           <w:numId w:val="3"/>
         </w:numPr>
+        <w:jc w:val="both"/>
         <w:rPr>
           <w:rFonts w:asciiTheme="majorBidi" w:hAnsiTheme="majorBidi" w:cstheme="majorBidi"/>
           <w:sz w:val="28"/>
@@ -915,6 +872,7 @@
           <w:ilvl w:val="0"/>
           <w:numId w:val="3"/>
         </w:numPr>
+        <w:jc w:val="both"/>
         <w:rPr>
           <w:rFonts w:asciiTheme="majorBidi" w:hAnsiTheme="majorBidi" w:cstheme="majorBidi"/>
           <w:sz w:val="28"/>
@@ -967,6 +925,7 @@
           <w:ilvl w:val="0"/>
           <w:numId w:val="3"/>
         </w:numPr>
+        <w:jc w:val="both"/>
         <w:rPr>
           <w:rFonts w:asciiTheme="majorBidi" w:hAnsiTheme="majorBidi" w:cstheme="majorBidi"/>
           <w:sz w:val="28"/>
@@ -1019,6 +978,7 @@
           <w:ilvl w:val="0"/>
           <w:numId w:val="3"/>
         </w:numPr>
+        <w:jc w:val="both"/>
         <w:rPr>
           <w:rFonts w:asciiTheme="majorBidi" w:hAnsiTheme="majorBidi" w:cstheme="majorBidi"/>
           <w:sz w:val="28"/>
@@ -1092,6 +1052,318 @@
           <w:szCs w:val="28"/>
         </w:rPr>
         <w:t xml:space="preserve"> files in your project root every time a task fails. Nobody wants these.</w:t>
+      </w:r>
+    </w:p>
+    <w:p>
+      <w:pPr>
+        <w:pStyle w:val="ListParagraph"/>
+        <w:numPr>
+          <w:ilvl w:val="0"/>
+          <w:numId w:val="9"/>
+        </w:numPr>
+        <w:ind w:left="720"/>
+        <w:jc w:val="both"/>
+        <w:rPr>
+          <w:rFonts w:asciiTheme="majorBidi" w:hAnsiTheme="majorBidi" w:cstheme="majorBidi"/>
+          <w:sz w:val="28"/>
+          <w:szCs w:val="28"/>
+        </w:rPr>
+      </w:pPr>
+      <w:r>
+        <w:rPr>
+          <w:rFonts w:asciiTheme="majorBidi" w:hAnsiTheme="majorBidi" w:cstheme="majorBidi"/>
+          <w:b/>
+          <w:bCs/>
+          <w:i/>
+          <w:iCs/>
+          <w:sz w:val="28"/>
+          <w:szCs w:val="28"/>
+        </w:rPr>
+        <w:t>timeout</w:t>
+      </w:r>
+      <w:r>
+        <w:rPr>
+          <w:rFonts w:asciiTheme="majorBidi" w:hAnsiTheme="majorBidi" w:cstheme="majorBidi"/>
+          <w:sz w:val="28"/>
+          <w:szCs w:val="28"/>
+        </w:rPr>
+        <w:t xml:space="preserve"> → SSH connection timeout in seconds. Default is 10. Worth increasing if your network is slow or hosts are geographically distant.</w:t>
+      </w:r>
+    </w:p>
+    <w:p>
+      <w:pPr>
+        <w:pStyle w:val="ListParagraph"/>
+        <w:numPr>
+          <w:ilvl w:val="0"/>
+          <w:numId w:val="9"/>
+        </w:numPr>
+        <w:ind w:left="720"/>
+        <w:jc w:val="both"/>
+        <w:rPr>
+          <w:rFonts w:asciiTheme="majorBidi" w:hAnsiTheme="majorBidi" w:cstheme="majorBidi"/>
+          <w:sz w:val="28"/>
+          <w:szCs w:val="28"/>
+        </w:rPr>
+      </w:pPr>
+      <w:proofErr w:type="spellStart"/>
+      <w:r>
+        <w:rPr>
+          <w:rFonts w:asciiTheme="majorBidi" w:hAnsiTheme="majorBidi" w:cstheme="majorBidi"/>
+          <w:b/>
+          <w:bCs/>
+          <w:i/>
+          <w:iCs/>
+          <w:sz w:val="28"/>
+          <w:szCs w:val="28"/>
+        </w:rPr>
+        <w:t>log_path</w:t>
+      </w:r>
+      <w:proofErr w:type="spellEnd"/>
+      <w:r>
+        <w:rPr>
+          <w:rFonts w:asciiTheme="majorBidi" w:hAnsiTheme="majorBidi" w:cstheme="majorBidi"/>
+          <w:sz w:val="28"/>
+          <w:szCs w:val="28"/>
+        </w:rPr>
+        <w:t xml:space="preserve"> → Ansible doesn't log to a file by default. If you want persistent logs (important in production), you must explicitly set this.</w:t>
+      </w:r>
+    </w:p>
+    <w:p>
+      <w:pPr>
+        <w:pStyle w:val="ListParagraph"/>
+        <w:numPr>
+          <w:ilvl w:val="0"/>
+          <w:numId w:val="9"/>
+        </w:numPr>
+        <w:ind w:left="720"/>
+        <w:jc w:val="both"/>
+        <w:rPr>
+          <w:rFonts w:asciiTheme="majorBidi" w:hAnsiTheme="majorBidi" w:cstheme="majorBidi"/>
+          <w:sz w:val="28"/>
+          <w:szCs w:val="28"/>
+        </w:rPr>
+      </w:pPr>
+      <w:proofErr w:type="spellStart"/>
+      <w:r>
+        <w:rPr>
+          <w:rFonts w:asciiTheme="majorBidi" w:hAnsiTheme="majorBidi" w:cstheme="majorBidi"/>
+          <w:b/>
+          <w:bCs/>
+          <w:i/>
+          <w:iCs/>
+          <w:sz w:val="28"/>
+          <w:szCs w:val="28"/>
+        </w:rPr>
+        <w:t>private_key_file</w:t>
+      </w:r>
+      <w:proofErr w:type="spellEnd"/>
+      <w:r>
+        <w:rPr>
+          <w:rFonts w:asciiTheme="majorBidi" w:hAnsiTheme="majorBidi" w:cstheme="majorBidi"/>
+          <w:sz w:val="28"/>
+          <w:szCs w:val="28"/>
+        </w:rPr>
+        <w:t xml:space="preserve"> → Path to your SSH private key. If you don't set this, Ansible falls back to SSH agent or default key locations. Better to be explicit.</w:t>
+      </w:r>
+    </w:p>
+    <w:p>
+      <w:pPr>
+        <w:pStyle w:val="ListParagraph"/>
+        <w:numPr>
+          <w:ilvl w:val="0"/>
+          <w:numId w:val="9"/>
+        </w:numPr>
+        <w:ind w:left="720"/>
+        <w:jc w:val="both"/>
+        <w:rPr>
+          <w:rFonts w:asciiTheme="majorBidi" w:hAnsiTheme="majorBidi" w:cstheme="majorBidi"/>
+          <w:sz w:val="28"/>
+          <w:szCs w:val="28"/>
+        </w:rPr>
+      </w:pPr>
+      <w:r>
+        <w:rPr>
+          <w:rFonts w:asciiTheme="majorBidi" w:hAnsiTheme="majorBidi" w:cstheme="majorBidi"/>
+          <w:b/>
+          <w:bCs/>
+          <w:i/>
+          <w:iCs/>
+          <w:sz w:val="28"/>
+          <w:szCs w:val="28"/>
+        </w:rPr>
+        <w:lastRenderedPageBreak/>
+        <w:t>gathering</w:t>
+      </w:r>
+      <w:r>
+        <w:rPr>
+          <w:rFonts w:asciiTheme="majorBidi" w:hAnsiTheme="majorBidi" w:cstheme="majorBidi"/>
+          <w:sz w:val="28"/>
+          <w:szCs w:val="28"/>
+        </w:rPr>
+        <w:t xml:space="preserve"> → Controls when facts are gathered. Default is </w:t>
+      </w:r>
+      <w:r>
+        <w:rPr>
+          <w:rFonts w:asciiTheme="majorBidi" w:hAnsiTheme="majorBidi" w:cstheme="majorBidi"/>
+          <w:b/>
+          <w:bCs/>
+          <w:i/>
+          <w:iCs/>
+          <w:sz w:val="28"/>
+          <w:szCs w:val="28"/>
+        </w:rPr>
+        <w:t>implicit</w:t>
+      </w:r>
+      <w:r>
+        <w:rPr>
+          <w:rFonts w:asciiTheme="majorBidi" w:hAnsiTheme="majorBidi" w:cstheme="majorBidi"/>
+          <w:sz w:val="28"/>
+          <w:szCs w:val="28"/>
+        </w:rPr>
+        <w:t xml:space="preserve"> (always gather). In large infrastructures setting it to </w:t>
+      </w:r>
+      <w:r>
+        <w:rPr>
+          <w:rFonts w:asciiTheme="majorBidi" w:hAnsiTheme="majorBidi" w:cstheme="majorBidi"/>
+          <w:b/>
+          <w:bCs/>
+          <w:i/>
+          <w:iCs/>
+          <w:sz w:val="28"/>
+          <w:szCs w:val="28"/>
+        </w:rPr>
+        <w:t>smart</w:t>
+      </w:r>
+      <w:r>
+        <w:rPr>
+          <w:rFonts w:asciiTheme="majorBidi" w:hAnsiTheme="majorBidi" w:cstheme="majorBidi"/>
+          <w:sz w:val="28"/>
+          <w:szCs w:val="28"/>
+        </w:rPr>
+        <w:t xml:space="preserve"> (only gather if not cached) or </w:t>
+      </w:r>
+      <w:r>
+        <w:rPr>
+          <w:rFonts w:asciiTheme="majorBidi" w:hAnsiTheme="majorBidi" w:cstheme="majorBidi"/>
+          <w:b/>
+          <w:bCs/>
+          <w:i/>
+          <w:iCs/>
+          <w:sz w:val="28"/>
+          <w:szCs w:val="28"/>
+        </w:rPr>
+        <w:t>explicit</w:t>
+      </w:r>
+      <w:r>
+        <w:rPr>
+          <w:rFonts w:asciiTheme="majorBidi" w:hAnsiTheme="majorBidi" w:cstheme="majorBidi"/>
+          <w:sz w:val="28"/>
+          <w:szCs w:val="28"/>
+        </w:rPr>
+        <w:t xml:space="preserve"> (never gather unless you call </w:t>
+      </w:r>
+      <w:proofErr w:type="spellStart"/>
+      <w:r>
+        <w:rPr>
+          <w:rFonts w:asciiTheme="majorBidi" w:hAnsiTheme="majorBidi" w:cstheme="majorBidi"/>
+          <w:b/>
+          <w:bCs/>
+          <w:i/>
+          <w:iCs/>
+          <w:sz w:val="28"/>
+          <w:szCs w:val="28"/>
+        </w:rPr>
+        <w:t>gather_facts</w:t>
+      </w:r>
+      <w:proofErr w:type="spellEnd"/>
+      <w:r>
+        <w:rPr>
+          <w:rFonts w:asciiTheme="majorBidi" w:hAnsiTheme="majorBidi" w:cstheme="majorBidi"/>
+          <w:b/>
+          <w:bCs/>
+          <w:i/>
+          <w:iCs/>
+          <w:sz w:val="28"/>
+          <w:szCs w:val="28"/>
+        </w:rPr>
+        <w:t>: true</w:t>
+      </w:r>
+      <w:r>
+        <w:rPr>
+          <w:rFonts w:asciiTheme="majorBidi" w:hAnsiTheme="majorBidi" w:cstheme="majorBidi"/>
+          <w:sz w:val="28"/>
+          <w:szCs w:val="28"/>
+        </w:rPr>
+        <w:t>) can save significant time.</w:t>
+      </w:r>
+    </w:p>
+    <w:p>
+      <w:pPr>
+        <w:pStyle w:val="ListParagraph"/>
+        <w:numPr>
+          <w:ilvl w:val="0"/>
+          <w:numId w:val="10"/>
+        </w:numPr>
+        <w:ind w:left="360"/>
+        <w:jc w:val="both"/>
+        <w:rPr>
+          <w:rFonts w:asciiTheme="majorBidi" w:hAnsiTheme="majorBidi" w:cstheme="majorBidi"/>
+          <w:b/>
+          <w:bCs/>
+          <w:i/>
+          <w:iCs/>
+          <w:sz w:val="32"/>
+          <w:szCs w:val="32"/>
+        </w:rPr>
+      </w:pPr>
+      <w:r>
+        <w:rPr>
+          <w:rFonts w:asciiTheme="majorBidi" w:hAnsiTheme="majorBidi" w:cstheme="majorBidi"/>
+          <w:b/>
+          <w:bCs/>
+          <w:i/>
+          <w:iCs/>
+          <w:sz w:val="32"/>
+          <w:szCs w:val="32"/>
+        </w:rPr>
+        <w:t>[inventory]</w:t>
+      </w:r>
+    </w:p>
+    <w:p>
+      <w:pPr>
+        <w:pStyle w:val="ListParagraph"/>
+        <w:numPr>
+          <w:ilvl w:val="0"/>
+          <w:numId w:val="11"/>
+        </w:numPr>
+        <w:jc w:val="both"/>
+        <w:rPr>
+          <w:rFonts w:asciiTheme="majorBidi" w:hAnsiTheme="majorBidi" w:cstheme="majorBidi"/>
+          <w:sz w:val="28"/>
+          <w:szCs w:val="28"/>
+        </w:rPr>
+      </w:pPr>
+      <w:proofErr w:type="spellStart"/>
+      <w:r>
+        <w:rPr>
+          <w:rFonts w:asciiTheme="majorBidi" w:hAnsiTheme="majorBidi" w:cstheme="majorBidi"/>
+          <w:b/>
+          <w:bCs/>
+          <w:i/>
+          <w:iCs/>
+          <w:sz w:val="28"/>
+          <w:szCs w:val="28"/>
+        </w:rPr>
+        <w:t>enable_plugins</w:t>
+      </w:r>
+      <w:proofErr w:type="spellEnd"/>
+      <w:r>
+        <w:rPr>
+          <w:rFonts w:asciiTheme="majorBidi" w:hAnsiTheme="majorBidi" w:cstheme="majorBidi"/>
+          <w:sz w:val="28"/>
+          <w:szCs w:val="28"/>
+        </w:rPr>
+        <w:t xml:space="preserve"> → Tells Ansible which inventory plugins to use and in what order. Important when you're using dynamic inventory (AWS, Azure, etc.) alongside static files.</w:t>
       </w:r>
     </w:p>
     <w:p>
@@ -1341,7 +1613,6 @@
           <w:sz w:val="28"/>
           <w:szCs w:val="28"/>
         </w:rPr>
-        <w:lastRenderedPageBreak/>
         <w:t>become_user</w:t>
       </w:r>
       <w:proofErr w:type="spellEnd"/>
@@ -1451,7 +1722,7 @@
           <w:ilvl w:val="0"/>
           <w:numId w:val="6"/>
         </w:numPr>
-        <w:spacing w:after="80"/>
+        <w:spacing w:after="60"/>
         <w:ind w:left="360"/>
         <w:rPr>
           <w:rFonts w:asciiTheme="majorBidi" w:hAnsiTheme="majorBidi" w:cstheme="majorBidi"/>
@@ -1528,7 +1799,7 @@
           <w:ilvl w:val="0"/>
           <w:numId w:val="7"/>
         </w:numPr>
-        <w:spacing w:after="120"/>
+        <w:spacing w:after="100"/>
         <w:jc w:val="both"/>
         <w:rPr>
           <w:rFonts w:asciiTheme="majorBidi" w:hAnsiTheme="majorBidi" w:cstheme="majorBidi"/>
@@ -1638,16 +1909,16 @@
         <mc:AlternateContent>
           <mc:Choice Requires="wps">
             <w:drawing>
-              <wp:anchor distT="0" distB="0" distL="114300" distR="114300" simplePos="0" relativeHeight="251659264" behindDoc="0" locked="0" layoutInCell="1" allowOverlap="1" wp14:anchorId="47A22301" wp14:editId="2BB64F4C">
+              <wp:anchor distT="0" distB="0" distL="114300" distR="114300" simplePos="0" relativeHeight="251659264" behindDoc="0" locked="0" layoutInCell="1" allowOverlap="1" wp14:anchorId="47A22301" wp14:editId="7DC8BB61">
                 <wp:simplePos x="0" y="0"/>
                 <wp:positionH relativeFrom="margin">
-                  <wp:align>right</wp:align>
+                  <wp:align>left</wp:align>
                 </wp:positionH>
                 <wp:positionV relativeFrom="paragraph">
-                  <wp:posOffset>502285</wp:posOffset>
+                  <wp:posOffset>483235</wp:posOffset>
                 </wp:positionV>
-                <wp:extent cx="6838950" cy="5581650"/>
-                <wp:effectExtent l="0" t="0" r="19050" b="19050"/>
+                <wp:extent cx="4333875" cy="3933825"/>
+                <wp:effectExtent l="0" t="0" r="28575" b="28575"/>
                 <wp:wrapNone/>
                 <wp:docPr id="1" name="Rectangle 1"/>
                 <wp:cNvGraphicFramePr/>
@@ -1658,7 +1929,7 @@
                       <wps:spPr>
                         <a:xfrm>
                           <a:off x="0" y="0"/>
-                          <a:ext cx="6838950" cy="5581650"/>
+                          <a:ext cx="4333875" cy="3933825"/>
                         </a:xfrm>
                         <a:prstGeom prst="rect">
                           <a:avLst/>
@@ -2268,338 +2539,6 @@
                                 <w:szCs w:val="28"/>
                               </w:rPr>
                               <w:t>become = True</w:t>
-                            </w:r>
-                          </w:p>
-                          <w:p>
-                            <w:pPr>
-                              <w:spacing w:after="0"/>
-                              <w:rPr>
-                                <w:rFonts w:asciiTheme="majorBidi" w:hAnsiTheme="majorBidi" w:cstheme="majorBidi"/>
-                                <w:b/>
-                                <w:bCs/>
-                                <w:i/>
-                                <w:iCs/>
-                                <w:sz w:val="28"/>
-                                <w:szCs w:val="28"/>
-                              </w:rPr>
-                            </w:pPr>
-                            <w:proofErr w:type="spellStart"/>
-                            <w:r>
-                              <w:rPr>
-                                <w:rFonts w:asciiTheme="majorBidi" w:hAnsiTheme="majorBidi" w:cstheme="majorBidi"/>
-                                <w:b/>
-                                <w:bCs/>
-                                <w:i/>
-                                <w:iCs/>
-                                <w:sz w:val="28"/>
-                                <w:szCs w:val="28"/>
-                              </w:rPr>
-                              <w:t>become_method</w:t>
-                            </w:r>
-                            <w:proofErr w:type="spellEnd"/>
-                            <w:r>
-                              <w:rPr>
-                                <w:rFonts w:asciiTheme="majorBidi" w:hAnsiTheme="majorBidi" w:cstheme="majorBidi"/>
-                                <w:b/>
-                                <w:bCs/>
-                                <w:i/>
-                                <w:iCs/>
-                                <w:sz w:val="28"/>
-                                <w:szCs w:val="28"/>
-                              </w:rPr>
-                              <w:t xml:space="preserve"> = </w:t>
-                            </w:r>
-                            <w:proofErr w:type="spellStart"/>
-                            <w:r>
-                              <w:rPr>
-                                <w:rFonts w:asciiTheme="majorBidi" w:hAnsiTheme="majorBidi" w:cstheme="majorBidi"/>
-                                <w:b/>
-                                <w:bCs/>
-                                <w:i/>
-                                <w:iCs/>
-                                <w:sz w:val="28"/>
-                                <w:szCs w:val="28"/>
-                              </w:rPr>
-                              <w:t>sudo</w:t>
-                            </w:r>
-                            <w:proofErr w:type="spellEnd"/>
-                          </w:p>
-                          <w:p>
-                            <w:pPr>
-                              <w:spacing w:after="0"/>
-                              <w:rPr>
-                                <w:rFonts w:asciiTheme="majorBidi" w:hAnsiTheme="majorBidi" w:cstheme="majorBidi"/>
-                                <w:b/>
-                                <w:bCs/>
-                                <w:i/>
-                                <w:iCs/>
-                                <w:sz w:val="28"/>
-                                <w:szCs w:val="28"/>
-                              </w:rPr>
-                            </w:pPr>
-                            <w:proofErr w:type="spellStart"/>
-                            <w:r>
-                              <w:rPr>
-                                <w:rFonts w:asciiTheme="majorBidi" w:hAnsiTheme="majorBidi" w:cstheme="majorBidi"/>
-                                <w:b/>
-                                <w:bCs/>
-                                <w:i/>
-                                <w:iCs/>
-                                <w:sz w:val="28"/>
-                                <w:szCs w:val="28"/>
-                              </w:rPr>
-                              <w:t>become_user</w:t>
-                            </w:r>
-                            <w:proofErr w:type="spellEnd"/>
-                            <w:r>
-                              <w:rPr>
-                                <w:rFonts w:asciiTheme="majorBidi" w:hAnsiTheme="majorBidi" w:cstheme="majorBidi"/>
-                                <w:b/>
-                                <w:bCs/>
-                                <w:i/>
-                                <w:iCs/>
-                                <w:sz w:val="28"/>
-                                <w:szCs w:val="28"/>
-                              </w:rPr>
-                              <w:t xml:space="preserve"> = root</w:t>
-                            </w:r>
-                          </w:p>
-                          <w:p>
-                            <w:pPr>
-                              <w:spacing w:after="120"/>
-                              <w:rPr>
-                                <w:rFonts w:asciiTheme="majorBidi" w:hAnsiTheme="majorBidi" w:cstheme="majorBidi"/>
-                                <w:b/>
-                                <w:bCs/>
-                                <w:i/>
-                                <w:iCs/>
-                                <w:sz w:val="28"/>
-                                <w:szCs w:val="28"/>
-                              </w:rPr>
-                            </w:pPr>
-                            <w:proofErr w:type="spellStart"/>
-                            <w:r>
-                              <w:rPr>
-                                <w:rFonts w:asciiTheme="majorBidi" w:hAnsiTheme="majorBidi" w:cstheme="majorBidi"/>
-                                <w:b/>
-                                <w:bCs/>
-                                <w:i/>
-                                <w:iCs/>
-                                <w:sz w:val="28"/>
-                                <w:szCs w:val="28"/>
-                              </w:rPr>
-                              <w:t>become_ask_pass</w:t>
-                            </w:r>
-                            <w:proofErr w:type="spellEnd"/>
-                            <w:r>
-                              <w:rPr>
-                                <w:rFonts w:asciiTheme="majorBidi" w:hAnsiTheme="majorBidi" w:cstheme="majorBidi"/>
-                                <w:b/>
-                                <w:bCs/>
-                                <w:i/>
-                                <w:iCs/>
-                                <w:sz w:val="28"/>
-                                <w:szCs w:val="28"/>
-                              </w:rPr>
-                              <w:t xml:space="preserve"> = False</w:t>
-                            </w:r>
-                          </w:p>
-                          <w:p>
-                            <w:pPr>
-                              <w:spacing w:after="0"/>
-                              <w:rPr>
-                                <w:rFonts w:asciiTheme="majorBidi" w:hAnsiTheme="majorBidi" w:cstheme="majorBidi"/>
-                                <w:b/>
-                                <w:bCs/>
-                                <w:i/>
-                                <w:iCs/>
-                                <w:sz w:val="28"/>
-                                <w:szCs w:val="28"/>
-                              </w:rPr>
-                            </w:pPr>
-                            <w:r>
-                              <w:rPr>
-                                <w:rFonts w:asciiTheme="majorBidi" w:hAnsiTheme="majorBidi" w:cstheme="majorBidi"/>
-                                <w:b/>
-                                <w:bCs/>
-                                <w:i/>
-                                <w:iCs/>
-                                <w:sz w:val="28"/>
-                                <w:szCs w:val="28"/>
-                              </w:rPr>
-                              <w:t>[</w:t>
-                            </w:r>
-                            <w:proofErr w:type="spellStart"/>
-                            <w:r>
-                              <w:rPr>
-                                <w:rFonts w:asciiTheme="majorBidi" w:hAnsiTheme="majorBidi" w:cstheme="majorBidi"/>
-                                <w:b/>
-                                <w:bCs/>
-                                <w:i/>
-                                <w:iCs/>
-                                <w:sz w:val="28"/>
-                                <w:szCs w:val="28"/>
-                              </w:rPr>
-                              <w:t>ssh_connection</w:t>
-                            </w:r>
-                            <w:proofErr w:type="spellEnd"/>
-                            <w:r>
-                              <w:rPr>
-                                <w:rFonts w:asciiTheme="majorBidi" w:hAnsiTheme="majorBidi" w:cstheme="majorBidi"/>
-                                <w:b/>
-                                <w:bCs/>
-                                <w:i/>
-                                <w:iCs/>
-                                <w:sz w:val="28"/>
-                                <w:szCs w:val="28"/>
-                              </w:rPr>
-                              <w:t>]</w:t>
-                            </w:r>
-                          </w:p>
-                          <w:p>
-                            <w:pPr>
-                              <w:spacing w:after="0"/>
-                              <w:rPr>
-                                <w:rFonts w:asciiTheme="majorBidi" w:hAnsiTheme="majorBidi" w:cstheme="majorBidi"/>
-                                <w:b/>
-                                <w:bCs/>
-                                <w:i/>
-                                <w:iCs/>
-                                <w:color w:val="808080" w:themeColor="background1" w:themeShade="80"/>
-                                <w:sz w:val="28"/>
-                                <w:szCs w:val="28"/>
-                              </w:rPr>
-                            </w:pPr>
-                            <w:r>
-                              <w:rPr>
-                                <w:rFonts w:asciiTheme="majorBidi" w:hAnsiTheme="majorBidi" w:cstheme="majorBidi"/>
-                                <w:b/>
-                                <w:bCs/>
-                                <w:i/>
-                                <w:iCs/>
-                                <w:color w:val="808080" w:themeColor="background1" w:themeShade="80"/>
-                                <w:sz w:val="28"/>
-                                <w:szCs w:val="28"/>
-                              </w:rPr>
-                              <w:t># Huge performance boost</w:t>
-                            </w:r>
-                          </w:p>
-                          <w:p>
-                            <w:pPr>
-                              <w:spacing w:after="0"/>
-                              <w:rPr>
-                                <w:rFonts w:asciiTheme="majorBidi" w:hAnsiTheme="majorBidi" w:cstheme="majorBidi"/>
-                                <w:b/>
-                                <w:bCs/>
-                                <w:i/>
-                                <w:iCs/>
-                                <w:sz w:val="28"/>
-                                <w:szCs w:val="28"/>
-                              </w:rPr>
-                            </w:pPr>
-                            <w:r>
-                              <w:rPr>
-                                <w:rFonts w:asciiTheme="majorBidi" w:hAnsiTheme="majorBidi" w:cstheme="majorBidi"/>
-                                <w:b/>
-                                <w:bCs/>
-                                <w:i/>
-                                <w:iCs/>
-                                <w:sz w:val="28"/>
-                                <w:szCs w:val="28"/>
-                              </w:rPr>
-                              <w:t>pipelining = True</w:t>
-                            </w:r>
-                          </w:p>
-                          <w:p>
-                            <w:pPr>
-                              <w:jc w:val="both"/>
-                              <w:rPr>
-                                <w:rFonts w:asciiTheme="majorBidi" w:hAnsiTheme="majorBidi" w:cstheme="majorBidi"/>
-                                <w:b/>
-                                <w:bCs/>
-                                <w:i/>
-                                <w:iCs/>
-                                <w:sz w:val="28"/>
-                                <w:szCs w:val="28"/>
-                              </w:rPr>
-                            </w:pPr>
-                            <w:proofErr w:type="spellStart"/>
-                            <w:r>
-                              <w:rPr>
-                                <w:rFonts w:asciiTheme="majorBidi" w:hAnsiTheme="majorBidi" w:cstheme="majorBidi"/>
-                                <w:b/>
-                                <w:bCs/>
-                                <w:i/>
-                                <w:iCs/>
-                                <w:sz w:val="28"/>
-                                <w:szCs w:val="28"/>
-                              </w:rPr>
-                              <w:t>ssh_args</w:t>
-                            </w:r>
-                            <w:proofErr w:type="spellEnd"/>
-                            <w:r>
-                              <w:rPr>
-                                <w:rFonts w:asciiTheme="majorBidi" w:hAnsiTheme="majorBidi" w:cstheme="majorBidi"/>
-                                <w:b/>
-                                <w:bCs/>
-                                <w:i/>
-                                <w:iCs/>
-                                <w:sz w:val="28"/>
-                                <w:szCs w:val="28"/>
-                              </w:rPr>
-                              <w:t xml:space="preserve"> = -o </w:t>
-                            </w:r>
-                            <w:proofErr w:type="spellStart"/>
-                            <w:r>
-                              <w:rPr>
-                                <w:rFonts w:asciiTheme="majorBidi" w:hAnsiTheme="majorBidi" w:cstheme="majorBidi"/>
-                                <w:b/>
-                                <w:bCs/>
-                                <w:i/>
-                                <w:iCs/>
-                                <w:sz w:val="28"/>
-                                <w:szCs w:val="28"/>
-                              </w:rPr>
-                              <w:t>ControlMaster</w:t>
-                            </w:r>
-                            <w:proofErr w:type="spellEnd"/>
-                            <w:r>
-                              <w:rPr>
-                                <w:rFonts w:asciiTheme="majorBidi" w:hAnsiTheme="majorBidi" w:cstheme="majorBidi"/>
-                                <w:b/>
-                                <w:bCs/>
-                                <w:i/>
-                                <w:iCs/>
-                                <w:sz w:val="28"/>
-                                <w:szCs w:val="28"/>
-                              </w:rPr>
-                              <w:t xml:space="preserve">=auto -o </w:t>
-                            </w:r>
-                            <w:proofErr w:type="spellStart"/>
-                            <w:r>
-                              <w:rPr>
-                                <w:rFonts w:asciiTheme="majorBidi" w:hAnsiTheme="majorBidi" w:cstheme="majorBidi"/>
-                                <w:b/>
-                                <w:bCs/>
-                                <w:i/>
-                                <w:iCs/>
-                                <w:sz w:val="28"/>
-                                <w:szCs w:val="28"/>
-                              </w:rPr>
-                              <w:t>ControlPersist</w:t>
-                            </w:r>
-                            <w:proofErr w:type="spellEnd"/>
-                            <w:r>
-                              <w:rPr>
-                                <w:rFonts w:asciiTheme="majorBidi" w:hAnsiTheme="majorBidi" w:cstheme="majorBidi"/>
-                                <w:b/>
-                                <w:bCs/>
-                                <w:i/>
-                                <w:iCs/>
-                                <w:sz w:val="28"/>
-                                <w:szCs w:val="28"/>
-                              </w:rPr>
-                              <w:t>=60s</w:t>
                             </w:r>
                           </w:p>
                           <w:p>
@@ -2655,7 +2594,7 @@
           </mc:Choice>
           <mc:Fallback>
             <w:pict>
-              <v:rect w14:anchorId="47A22301" id="Rectangle 1" o:spid="_x0000_s1026" style="position:absolute;left:0;text-align:left;margin-left:487.3pt;margin-top:39.55pt;width:538.5pt;height:439.5pt;z-index:251659264;visibility:visible;mso-wrap-style:square;mso-width-percent:0;mso-height-percent:0;mso-wrap-distance-left:9pt;mso-wrap-distance-top:0;mso-wrap-distance-right:9pt;mso-wrap-distance-bottom:0;mso-position-horizontal:right;mso-position-horizontal-relative:margin;mso-position-vertical:absolute;mso-position-vertical-relative:text;mso-width-percent:0;mso-height-percent:0;mso-width-relative:margin;mso-height-relative:margin;v-text-anchor:middle" o:gfxdata="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" fillcolor="black [3200]" strokecolor="black [480]" strokeweight="1pt">
+              <v:rect w14:anchorId="47A22301" id="Rectangle 1" o:spid="_x0000_s1026" style="position:absolute;left:0;text-align:left;margin-left:0;margin-top:38.05pt;width:341.25pt;height:309.75pt;z-index:251659264;visibility:visible;mso-wrap-style:square;mso-width-percent:0;mso-height-percent:0;mso-wrap-distance-left:9pt;mso-wrap-distance-top:0;mso-wrap-distance-right:9pt;mso-wrap-distance-bottom:0;mso-position-horizontal:left;mso-position-horizontal-relative:margin;mso-position-vertical:absolute;mso-position-vertical-relative:text;mso-width-percent:0;mso-height-percent:0;mso-width-relative:margin;mso-height-relative:margin;v-text-anchor:middle" o:gfxdata="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" fillcolor="black [3200]" strokecolor="black [480]" strokeweight="1pt">
                 <v:textbox>
                   <w:txbxContent>
                     <w:p>
@@ -3244,338 +3183,6 @@
                           <w:szCs w:val="28"/>
                         </w:rPr>
                         <w:t>become = True</w:t>
-                      </w:r>
-                    </w:p>
-                    <w:p>
-                      <w:pPr>
-                        <w:spacing w:after="0"/>
-                        <w:rPr>
-                          <w:rFonts w:asciiTheme="majorBidi" w:hAnsiTheme="majorBidi" w:cstheme="majorBidi"/>
-                          <w:b/>
-                          <w:bCs/>
-                          <w:i/>
-                          <w:iCs/>
-                          <w:sz w:val="28"/>
-                          <w:szCs w:val="28"/>
-                        </w:rPr>
-                      </w:pPr>
-                      <w:proofErr w:type="spellStart"/>
-                      <w:r>
-                        <w:rPr>
-                          <w:rFonts w:asciiTheme="majorBidi" w:hAnsiTheme="majorBidi" w:cstheme="majorBidi"/>
-                          <w:b/>
-                          <w:bCs/>
-                          <w:i/>
-                          <w:iCs/>
-                          <w:sz w:val="28"/>
-                          <w:szCs w:val="28"/>
-                        </w:rPr>
-                        <w:t>become_method</w:t>
-                      </w:r>
-                      <w:proofErr w:type="spellEnd"/>
-                      <w:r>
-                        <w:rPr>
-                          <w:rFonts w:asciiTheme="majorBidi" w:hAnsiTheme="majorBidi" w:cstheme="majorBidi"/>
-                          <w:b/>
-                          <w:bCs/>
-                          <w:i/>
-                          <w:iCs/>
-                          <w:sz w:val="28"/>
-                          <w:szCs w:val="28"/>
-                        </w:rPr>
-                        <w:t xml:space="preserve"> = </w:t>
-                      </w:r>
-                      <w:proofErr w:type="spellStart"/>
-                      <w:r>
-                        <w:rPr>
-                          <w:rFonts w:asciiTheme="majorBidi" w:hAnsiTheme="majorBidi" w:cstheme="majorBidi"/>
-                          <w:b/>
-                          <w:bCs/>
-                          <w:i/>
-                          <w:iCs/>
-                          <w:sz w:val="28"/>
-                          <w:szCs w:val="28"/>
-                        </w:rPr>
-                        <w:t>sudo</w:t>
-                      </w:r>
-                      <w:proofErr w:type="spellEnd"/>
-                    </w:p>
-                    <w:p>
-                      <w:pPr>
-                        <w:spacing w:after="0"/>
-                        <w:rPr>
-                          <w:rFonts w:asciiTheme="majorBidi" w:hAnsiTheme="majorBidi" w:cstheme="majorBidi"/>
-                          <w:b/>
-                          <w:bCs/>
-                          <w:i/>
-                          <w:iCs/>
-                          <w:sz w:val="28"/>
-                          <w:szCs w:val="28"/>
-                        </w:rPr>
-                      </w:pPr>
-                      <w:proofErr w:type="spellStart"/>
-                      <w:r>
-                        <w:rPr>
-                          <w:rFonts w:asciiTheme="majorBidi" w:hAnsiTheme="majorBidi" w:cstheme="majorBidi"/>
-                          <w:b/>
-                          <w:bCs/>
-                          <w:i/>
-                          <w:iCs/>
-                          <w:sz w:val="28"/>
-                          <w:szCs w:val="28"/>
-                        </w:rPr>
-                        <w:t>become_user</w:t>
-                      </w:r>
-                      <w:proofErr w:type="spellEnd"/>
-                      <w:r>
-                        <w:rPr>
-                          <w:rFonts w:asciiTheme="majorBidi" w:hAnsiTheme="majorBidi" w:cstheme="majorBidi"/>
-                          <w:b/>
-                          <w:bCs/>
-                          <w:i/>
-                          <w:iCs/>
-                          <w:sz w:val="28"/>
-                          <w:szCs w:val="28"/>
-                        </w:rPr>
-                        <w:t xml:space="preserve"> = root</w:t>
-                      </w:r>
-                    </w:p>
-                    <w:p>
-                      <w:pPr>
-                        <w:spacing w:after="120"/>
-                        <w:rPr>
-                          <w:rFonts w:asciiTheme="majorBidi" w:hAnsiTheme="majorBidi" w:cstheme="majorBidi"/>
-                          <w:b/>
-                          <w:bCs/>
-                          <w:i/>
-                          <w:iCs/>
-                          <w:sz w:val="28"/>
-                          <w:szCs w:val="28"/>
-                        </w:rPr>
-                      </w:pPr>
-                      <w:proofErr w:type="spellStart"/>
-                      <w:r>
-                        <w:rPr>
-                          <w:rFonts w:asciiTheme="majorBidi" w:hAnsiTheme="majorBidi" w:cstheme="majorBidi"/>
-                          <w:b/>
-                          <w:bCs/>
-                          <w:i/>
-                          <w:iCs/>
-                          <w:sz w:val="28"/>
-                          <w:szCs w:val="28"/>
-                        </w:rPr>
-                        <w:t>become_ask_pass</w:t>
-                      </w:r>
-                      <w:proofErr w:type="spellEnd"/>
-                      <w:r>
-                        <w:rPr>
-                          <w:rFonts w:asciiTheme="majorBidi" w:hAnsiTheme="majorBidi" w:cstheme="majorBidi"/>
-                          <w:b/>
-                          <w:bCs/>
-                          <w:i/>
-                          <w:iCs/>
-                          <w:sz w:val="28"/>
-                          <w:szCs w:val="28"/>
-                        </w:rPr>
-                        <w:t xml:space="preserve"> = False</w:t>
-                      </w:r>
-                    </w:p>
-                    <w:p>
-                      <w:pPr>
-                        <w:spacing w:after="0"/>
-                        <w:rPr>
-                          <w:rFonts w:asciiTheme="majorBidi" w:hAnsiTheme="majorBidi" w:cstheme="majorBidi"/>
-                          <w:b/>
-                          <w:bCs/>
-                          <w:i/>
-                          <w:iCs/>
-                          <w:sz w:val="28"/>
-                          <w:szCs w:val="28"/>
-                        </w:rPr>
-                      </w:pPr>
-                      <w:r>
-                        <w:rPr>
-                          <w:rFonts w:asciiTheme="majorBidi" w:hAnsiTheme="majorBidi" w:cstheme="majorBidi"/>
-                          <w:b/>
-                          <w:bCs/>
-                          <w:i/>
-                          <w:iCs/>
-                          <w:sz w:val="28"/>
-                          <w:szCs w:val="28"/>
-                        </w:rPr>
-                        <w:t>[</w:t>
-                      </w:r>
-                      <w:proofErr w:type="spellStart"/>
-                      <w:r>
-                        <w:rPr>
-                          <w:rFonts w:asciiTheme="majorBidi" w:hAnsiTheme="majorBidi" w:cstheme="majorBidi"/>
-                          <w:b/>
-                          <w:bCs/>
-                          <w:i/>
-                          <w:iCs/>
-                          <w:sz w:val="28"/>
-                          <w:szCs w:val="28"/>
-                        </w:rPr>
-                        <w:t>ssh_connection</w:t>
-                      </w:r>
-                      <w:proofErr w:type="spellEnd"/>
-                      <w:r>
-                        <w:rPr>
-                          <w:rFonts w:asciiTheme="majorBidi" w:hAnsiTheme="majorBidi" w:cstheme="majorBidi"/>
-                          <w:b/>
-                          <w:bCs/>
-                          <w:i/>
-                          <w:iCs/>
-                          <w:sz w:val="28"/>
-                          <w:szCs w:val="28"/>
-                        </w:rPr>
-                        <w:t>]</w:t>
-                      </w:r>
-                    </w:p>
-                    <w:p>
-                      <w:pPr>
-                        <w:spacing w:after="0"/>
-                        <w:rPr>
-                          <w:rFonts w:asciiTheme="majorBidi" w:hAnsiTheme="majorBidi" w:cstheme="majorBidi"/>
-                          <w:b/>
-                          <w:bCs/>
-                          <w:i/>
-                          <w:iCs/>
-                          <w:color w:val="808080" w:themeColor="background1" w:themeShade="80"/>
-                          <w:sz w:val="28"/>
-                          <w:szCs w:val="28"/>
-                        </w:rPr>
-                      </w:pPr>
-                      <w:r>
-                        <w:rPr>
-                          <w:rFonts w:asciiTheme="majorBidi" w:hAnsiTheme="majorBidi" w:cstheme="majorBidi"/>
-                          <w:b/>
-                          <w:bCs/>
-                          <w:i/>
-                          <w:iCs/>
-                          <w:color w:val="808080" w:themeColor="background1" w:themeShade="80"/>
-                          <w:sz w:val="28"/>
-                          <w:szCs w:val="28"/>
-                        </w:rPr>
-                        <w:t># Huge performance boost</w:t>
-                      </w:r>
-                    </w:p>
-                    <w:p>
-                      <w:pPr>
-                        <w:spacing w:after="0"/>
-                        <w:rPr>
-                          <w:rFonts w:asciiTheme="majorBidi" w:hAnsiTheme="majorBidi" w:cstheme="majorBidi"/>
-                          <w:b/>
-                          <w:bCs/>
-                          <w:i/>
-                          <w:iCs/>
-                          <w:sz w:val="28"/>
-                          <w:szCs w:val="28"/>
-                        </w:rPr>
-                      </w:pPr>
-                      <w:r>
-                        <w:rPr>
-                          <w:rFonts w:asciiTheme="majorBidi" w:hAnsiTheme="majorBidi" w:cstheme="majorBidi"/>
-                          <w:b/>
-                          <w:bCs/>
-                          <w:i/>
-                          <w:iCs/>
-                          <w:sz w:val="28"/>
-                          <w:szCs w:val="28"/>
-                        </w:rPr>
-                        <w:t>pipelining = True</w:t>
-                      </w:r>
-                    </w:p>
-                    <w:p>
-                      <w:pPr>
-                        <w:jc w:val="both"/>
-                        <w:rPr>
-                          <w:rFonts w:asciiTheme="majorBidi" w:hAnsiTheme="majorBidi" w:cstheme="majorBidi"/>
-                          <w:b/>
-                          <w:bCs/>
-                          <w:i/>
-                          <w:iCs/>
-                          <w:sz w:val="28"/>
-                          <w:szCs w:val="28"/>
-                        </w:rPr>
-                      </w:pPr>
-                      <w:proofErr w:type="spellStart"/>
-                      <w:r>
-                        <w:rPr>
-                          <w:rFonts w:asciiTheme="majorBidi" w:hAnsiTheme="majorBidi" w:cstheme="majorBidi"/>
-                          <w:b/>
-                          <w:bCs/>
-                          <w:i/>
-                          <w:iCs/>
-                          <w:sz w:val="28"/>
-                          <w:szCs w:val="28"/>
-                        </w:rPr>
-                        <w:t>ssh_args</w:t>
-                      </w:r>
-                      <w:proofErr w:type="spellEnd"/>
-                      <w:r>
-                        <w:rPr>
-                          <w:rFonts w:asciiTheme="majorBidi" w:hAnsiTheme="majorBidi" w:cstheme="majorBidi"/>
-                          <w:b/>
-                          <w:bCs/>
-                          <w:i/>
-                          <w:iCs/>
-                          <w:sz w:val="28"/>
-                          <w:szCs w:val="28"/>
-                        </w:rPr>
-                        <w:t xml:space="preserve"> = -o </w:t>
-                      </w:r>
-                      <w:proofErr w:type="spellStart"/>
-                      <w:r>
-                        <w:rPr>
-                          <w:rFonts w:asciiTheme="majorBidi" w:hAnsiTheme="majorBidi" w:cstheme="majorBidi"/>
-                          <w:b/>
-                          <w:bCs/>
-                          <w:i/>
-                          <w:iCs/>
-                          <w:sz w:val="28"/>
-                          <w:szCs w:val="28"/>
-                        </w:rPr>
-                        <w:t>ControlMaster</w:t>
-                      </w:r>
-                      <w:proofErr w:type="spellEnd"/>
-                      <w:r>
-                        <w:rPr>
-                          <w:rFonts w:asciiTheme="majorBidi" w:hAnsiTheme="majorBidi" w:cstheme="majorBidi"/>
-                          <w:b/>
-                          <w:bCs/>
-                          <w:i/>
-                          <w:iCs/>
-                          <w:sz w:val="28"/>
-                          <w:szCs w:val="28"/>
-                        </w:rPr>
-                        <w:t xml:space="preserve">=auto -o </w:t>
-                      </w:r>
-                      <w:proofErr w:type="spellStart"/>
-                      <w:r>
-                        <w:rPr>
-                          <w:rFonts w:asciiTheme="majorBidi" w:hAnsiTheme="majorBidi" w:cstheme="majorBidi"/>
-                          <w:b/>
-                          <w:bCs/>
-                          <w:i/>
-                          <w:iCs/>
-                          <w:sz w:val="28"/>
-                          <w:szCs w:val="28"/>
-                        </w:rPr>
-                        <w:t>ControlPersist</w:t>
-                      </w:r>
-                      <w:proofErr w:type="spellEnd"/>
-                      <w:r>
-                        <w:rPr>
-                          <w:rFonts w:asciiTheme="majorBidi" w:hAnsiTheme="majorBidi" w:cstheme="majorBidi"/>
-                          <w:b/>
-                          <w:bCs/>
-                          <w:i/>
-                          <w:iCs/>
-                          <w:sz w:val="28"/>
-                          <w:szCs w:val="28"/>
-                        </w:rPr>
-                        <w:t>=60s</w:t>
                       </w:r>
                     </w:p>
                     <w:p>
@@ -3764,6 +3371,768 @@
           <w:szCs w:val="28"/>
         </w:rPr>
       </w:pPr>
+      <w:r>
+        <w:rPr>
+          <w:rFonts w:asciiTheme="majorBidi" w:hAnsiTheme="majorBidi" w:cstheme="majorBidi"/>
+          <w:noProof/>
+          <w:sz w:val="28"/>
+          <w:szCs w:val="28"/>
+        </w:rPr>
+        <w:lastRenderedPageBreak/>
+        <mc:AlternateContent>
+          <mc:Choice Requires="wps">
+            <w:drawing>
+              <wp:anchor distT="0" distB="0" distL="114300" distR="114300" simplePos="0" relativeHeight="251660288" behindDoc="0" locked="0" layoutInCell="1" allowOverlap="1" wp14:anchorId="7D632F2D" wp14:editId="4656C1A3">
+                <wp:simplePos x="0" y="0"/>
+                <wp:positionH relativeFrom="margin">
+                  <wp:align>left</wp:align>
+                </wp:positionH>
+                <wp:positionV relativeFrom="paragraph">
+                  <wp:posOffset>-38100</wp:posOffset>
+                </wp:positionV>
+                <wp:extent cx="4333875" cy="1743075"/>
+                <wp:effectExtent l="0" t="0" r="28575" b="28575"/>
+                <wp:wrapNone/>
+                <wp:docPr id="2" name="Rectangle 2"/>
+                <wp:cNvGraphicFramePr/>
+                <a:graphic xmlns:a="http://schemas.openxmlformats.org/drawingml/2006/main">
+                  <a:graphicData uri="http://schemas.microsoft.com/office/word/2010/wordprocessingShape">
+                    <wps:wsp>
+                      <wps:cNvSpPr/>
+                      <wps:spPr>
+                        <a:xfrm>
+                          <a:off x="0" y="0"/>
+                          <a:ext cx="4333875" cy="1743075"/>
+                        </a:xfrm>
+                        <a:prstGeom prst="rect">
+                          <a:avLst/>
+                        </a:prstGeom>
+                      </wps:spPr>
+                      <wps:style>
+                        <a:lnRef idx="2">
+                          <a:schemeClr val="dk1">
+                            <a:shade val="15000"/>
+                          </a:schemeClr>
+                        </a:lnRef>
+                        <a:fillRef idx="1">
+                          <a:schemeClr val="dk1"/>
+                        </a:fillRef>
+                        <a:effectRef idx="0">
+                          <a:schemeClr val="dk1"/>
+                        </a:effectRef>
+                        <a:fontRef idx="minor">
+                          <a:schemeClr val="lt1"/>
+                        </a:fontRef>
+                      </wps:style>
+                      <wps:txbx>
+                        <w:txbxContent>
+                          <w:p>
+                            <w:pPr>
+                              <w:spacing w:after="0"/>
+                              <w:rPr>
+                                <w:rFonts w:asciiTheme="majorBidi" w:hAnsiTheme="majorBidi" w:cstheme="majorBidi"/>
+                                <w:b/>
+                                <w:bCs/>
+                                <w:i/>
+                                <w:iCs/>
+                                <w:sz w:val="28"/>
+                                <w:szCs w:val="28"/>
+                              </w:rPr>
+                            </w:pPr>
+                            <w:proofErr w:type="spellStart"/>
+                            <w:r>
+                              <w:rPr>
+                                <w:rFonts w:asciiTheme="majorBidi" w:hAnsiTheme="majorBidi" w:cstheme="majorBidi"/>
+                                <w:b/>
+                                <w:bCs/>
+                                <w:i/>
+                                <w:iCs/>
+                                <w:sz w:val="28"/>
+                                <w:szCs w:val="28"/>
+                              </w:rPr>
+                              <w:t>become_method</w:t>
+                            </w:r>
+                            <w:proofErr w:type="spellEnd"/>
+                            <w:r>
+                              <w:rPr>
+                                <w:rFonts w:asciiTheme="majorBidi" w:hAnsiTheme="majorBidi" w:cstheme="majorBidi"/>
+                                <w:b/>
+                                <w:bCs/>
+                                <w:i/>
+                                <w:iCs/>
+                                <w:sz w:val="28"/>
+                                <w:szCs w:val="28"/>
+                              </w:rPr>
+                              <w:t xml:space="preserve"> = </w:t>
+                            </w:r>
+                            <w:proofErr w:type="spellStart"/>
+                            <w:r>
+                              <w:rPr>
+                                <w:rFonts w:asciiTheme="majorBidi" w:hAnsiTheme="majorBidi" w:cstheme="majorBidi"/>
+                                <w:b/>
+                                <w:bCs/>
+                                <w:i/>
+                                <w:iCs/>
+                                <w:sz w:val="28"/>
+                                <w:szCs w:val="28"/>
+                              </w:rPr>
+                              <w:t>sudo</w:t>
+                            </w:r>
+                            <w:proofErr w:type="spellEnd"/>
+                          </w:p>
+                          <w:p>
+                            <w:pPr>
+                              <w:spacing w:after="0"/>
+                              <w:rPr>
+                                <w:rFonts w:asciiTheme="majorBidi" w:hAnsiTheme="majorBidi" w:cstheme="majorBidi"/>
+                                <w:b/>
+                                <w:bCs/>
+                                <w:i/>
+                                <w:iCs/>
+                                <w:sz w:val="28"/>
+                                <w:szCs w:val="28"/>
+                              </w:rPr>
+                            </w:pPr>
+                            <w:proofErr w:type="spellStart"/>
+                            <w:r>
+                              <w:rPr>
+                                <w:rFonts w:asciiTheme="majorBidi" w:hAnsiTheme="majorBidi" w:cstheme="majorBidi"/>
+                                <w:b/>
+                                <w:bCs/>
+                                <w:i/>
+                                <w:iCs/>
+                                <w:sz w:val="28"/>
+                                <w:szCs w:val="28"/>
+                              </w:rPr>
+                              <w:t>become_user</w:t>
+                            </w:r>
+                            <w:proofErr w:type="spellEnd"/>
+                            <w:r>
+                              <w:rPr>
+                                <w:rFonts w:asciiTheme="majorBidi" w:hAnsiTheme="majorBidi" w:cstheme="majorBidi"/>
+                                <w:b/>
+                                <w:bCs/>
+                                <w:i/>
+                                <w:iCs/>
+                                <w:sz w:val="28"/>
+                                <w:szCs w:val="28"/>
+                              </w:rPr>
+                              <w:t xml:space="preserve"> = root</w:t>
+                            </w:r>
+                          </w:p>
+                          <w:p>
+                            <w:pPr>
+                              <w:spacing w:after="120"/>
+                              <w:rPr>
+                                <w:rFonts w:asciiTheme="majorBidi" w:hAnsiTheme="majorBidi" w:cstheme="majorBidi"/>
+                                <w:b/>
+                                <w:bCs/>
+                                <w:i/>
+                                <w:iCs/>
+                                <w:sz w:val="28"/>
+                                <w:szCs w:val="28"/>
+                              </w:rPr>
+                            </w:pPr>
+                            <w:proofErr w:type="spellStart"/>
+                            <w:r>
+                              <w:rPr>
+                                <w:rFonts w:asciiTheme="majorBidi" w:hAnsiTheme="majorBidi" w:cstheme="majorBidi"/>
+                                <w:b/>
+                                <w:bCs/>
+                                <w:i/>
+                                <w:iCs/>
+                                <w:sz w:val="28"/>
+                                <w:szCs w:val="28"/>
+                              </w:rPr>
+                              <w:t>become_ask_pass</w:t>
+                            </w:r>
+                            <w:proofErr w:type="spellEnd"/>
+                            <w:r>
+                              <w:rPr>
+                                <w:rFonts w:asciiTheme="majorBidi" w:hAnsiTheme="majorBidi" w:cstheme="majorBidi"/>
+                                <w:b/>
+                                <w:bCs/>
+                                <w:i/>
+                                <w:iCs/>
+                                <w:sz w:val="28"/>
+                                <w:szCs w:val="28"/>
+                              </w:rPr>
+                              <w:t xml:space="preserve"> = False</w:t>
+                            </w:r>
+                          </w:p>
+                          <w:p>
+                            <w:pPr>
+                              <w:spacing w:after="0"/>
+                              <w:rPr>
+                                <w:rFonts w:asciiTheme="majorBidi" w:hAnsiTheme="majorBidi" w:cstheme="majorBidi"/>
+                                <w:b/>
+                                <w:bCs/>
+                                <w:i/>
+                                <w:iCs/>
+                                <w:sz w:val="28"/>
+                                <w:szCs w:val="28"/>
+                              </w:rPr>
+                            </w:pPr>
+                            <w:r>
+                              <w:rPr>
+                                <w:rFonts w:asciiTheme="majorBidi" w:hAnsiTheme="majorBidi" w:cstheme="majorBidi"/>
+                                <w:b/>
+                                <w:bCs/>
+                                <w:i/>
+                                <w:iCs/>
+                                <w:sz w:val="28"/>
+                                <w:szCs w:val="28"/>
+                              </w:rPr>
+                              <w:t>[</w:t>
+                            </w:r>
+                            <w:proofErr w:type="spellStart"/>
+                            <w:r>
+                              <w:rPr>
+                                <w:rFonts w:asciiTheme="majorBidi" w:hAnsiTheme="majorBidi" w:cstheme="majorBidi"/>
+                                <w:b/>
+                                <w:bCs/>
+                                <w:i/>
+                                <w:iCs/>
+                                <w:sz w:val="28"/>
+                                <w:szCs w:val="28"/>
+                              </w:rPr>
+                              <w:t>ssh_connection</w:t>
+                            </w:r>
+                            <w:proofErr w:type="spellEnd"/>
+                            <w:r>
+                              <w:rPr>
+                                <w:rFonts w:asciiTheme="majorBidi" w:hAnsiTheme="majorBidi" w:cstheme="majorBidi"/>
+                                <w:b/>
+                                <w:bCs/>
+                                <w:i/>
+                                <w:iCs/>
+                                <w:sz w:val="28"/>
+                                <w:szCs w:val="28"/>
+                              </w:rPr>
+                              <w:t>]</w:t>
+                            </w:r>
+                          </w:p>
+                          <w:p>
+                            <w:pPr>
+                              <w:spacing w:after="0"/>
+                              <w:rPr>
+                                <w:rFonts w:asciiTheme="majorBidi" w:hAnsiTheme="majorBidi" w:cstheme="majorBidi"/>
+                                <w:b/>
+                                <w:bCs/>
+                                <w:i/>
+                                <w:iCs/>
+                                <w:color w:val="808080" w:themeColor="background1" w:themeShade="80"/>
+                                <w:sz w:val="28"/>
+                                <w:szCs w:val="28"/>
+                              </w:rPr>
+                            </w:pPr>
+                            <w:r>
+                              <w:rPr>
+                                <w:rFonts w:asciiTheme="majorBidi" w:hAnsiTheme="majorBidi" w:cstheme="majorBidi"/>
+                                <w:b/>
+                                <w:bCs/>
+                                <w:i/>
+                                <w:iCs/>
+                                <w:color w:val="808080" w:themeColor="background1" w:themeShade="80"/>
+                                <w:sz w:val="28"/>
+                                <w:szCs w:val="28"/>
+                              </w:rPr>
+                              <w:t># Huge performance boost</w:t>
+                            </w:r>
+                          </w:p>
+                          <w:p>
+                            <w:pPr>
+                              <w:spacing w:after="0"/>
+                              <w:rPr>
+                                <w:rFonts w:asciiTheme="majorBidi" w:hAnsiTheme="majorBidi" w:cstheme="majorBidi"/>
+                                <w:b/>
+                                <w:bCs/>
+                                <w:i/>
+                                <w:iCs/>
+                                <w:sz w:val="28"/>
+                                <w:szCs w:val="28"/>
+                              </w:rPr>
+                            </w:pPr>
+                            <w:r>
+                              <w:rPr>
+                                <w:rFonts w:asciiTheme="majorBidi" w:hAnsiTheme="majorBidi" w:cstheme="majorBidi"/>
+                                <w:b/>
+                                <w:bCs/>
+                                <w:i/>
+                                <w:iCs/>
+                                <w:sz w:val="28"/>
+                                <w:szCs w:val="28"/>
+                              </w:rPr>
+                              <w:t>pipelining = True</w:t>
+                            </w:r>
+                          </w:p>
+                          <w:p>
+                            <w:pPr>
+                              <w:jc w:val="both"/>
+                              <w:rPr>
+                                <w:rFonts w:asciiTheme="majorBidi" w:hAnsiTheme="majorBidi" w:cstheme="majorBidi"/>
+                                <w:b/>
+                                <w:bCs/>
+                                <w:i/>
+                                <w:iCs/>
+                                <w:sz w:val="28"/>
+                                <w:szCs w:val="28"/>
+                              </w:rPr>
+                            </w:pPr>
+                            <w:proofErr w:type="spellStart"/>
+                            <w:r>
+                              <w:rPr>
+                                <w:rFonts w:asciiTheme="majorBidi" w:hAnsiTheme="majorBidi" w:cstheme="majorBidi"/>
+                                <w:b/>
+                                <w:bCs/>
+                                <w:i/>
+                                <w:iCs/>
+                                <w:sz w:val="28"/>
+                                <w:szCs w:val="28"/>
+                              </w:rPr>
+                              <w:t>ssh_args</w:t>
+                            </w:r>
+                            <w:proofErr w:type="spellEnd"/>
+                            <w:r>
+                              <w:rPr>
+                                <w:rFonts w:asciiTheme="majorBidi" w:hAnsiTheme="majorBidi" w:cstheme="majorBidi"/>
+                                <w:b/>
+                                <w:bCs/>
+                                <w:i/>
+                                <w:iCs/>
+                                <w:sz w:val="28"/>
+                                <w:szCs w:val="28"/>
+                              </w:rPr>
+                              <w:t xml:space="preserve"> = -o </w:t>
+                            </w:r>
+                            <w:proofErr w:type="spellStart"/>
+                            <w:r>
+                              <w:rPr>
+                                <w:rFonts w:asciiTheme="majorBidi" w:hAnsiTheme="majorBidi" w:cstheme="majorBidi"/>
+                                <w:b/>
+                                <w:bCs/>
+                                <w:i/>
+                                <w:iCs/>
+                                <w:sz w:val="28"/>
+                                <w:szCs w:val="28"/>
+                              </w:rPr>
+                              <w:t>ControlMaster</w:t>
+                            </w:r>
+                            <w:proofErr w:type="spellEnd"/>
+                            <w:r>
+                              <w:rPr>
+                                <w:rFonts w:asciiTheme="majorBidi" w:hAnsiTheme="majorBidi" w:cstheme="majorBidi"/>
+                                <w:b/>
+                                <w:bCs/>
+                                <w:i/>
+                                <w:iCs/>
+                                <w:sz w:val="28"/>
+                                <w:szCs w:val="28"/>
+                              </w:rPr>
+                              <w:t xml:space="preserve">=auto -o </w:t>
+                            </w:r>
+                            <w:proofErr w:type="spellStart"/>
+                            <w:r>
+                              <w:rPr>
+                                <w:rFonts w:asciiTheme="majorBidi" w:hAnsiTheme="majorBidi" w:cstheme="majorBidi"/>
+                                <w:b/>
+                                <w:bCs/>
+                                <w:i/>
+                                <w:iCs/>
+                                <w:sz w:val="28"/>
+                                <w:szCs w:val="28"/>
+                              </w:rPr>
+                              <w:t>ControlPersist</w:t>
+                            </w:r>
+                            <w:proofErr w:type="spellEnd"/>
+                            <w:r>
+                              <w:rPr>
+                                <w:rFonts w:asciiTheme="majorBidi" w:hAnsiTheme="majorBidi" w:cstheme="majorBidi"/>
+                                <w:b/>
+                                <w:bCs/>
+                                <w:i/>
+                                <w:iCs/>
+                                <w:sz w:val="28"/>
+                                <w:szCs w:val="28"/>
+                              </w:rPr>
+                              <w:t>=60s</w:t>
+                            </w:r>
+                          </w:p>
+                          <w:p>
+                            <w:pPr>
+                              <w:jc w:val="center"/>
+                            </w:pPr>
+                          </w:p>
+                        </w:txbxContent>
+                      </wps:txbx>
+                      <wps:bodyPr rot="0" spcFirstLastPara="0" vertOverflow="overflow" horzOverflow="overflow" vert="horz" wrap="square" lIns="91440" tIns="45720" rIns="91440" bIns="45720" numCol="1" spcCol="0" rtlCol="0" fromWordArt="0" anchor="ctr" anchorCtr="0" forceAA="0" compatLnSpc="1">
+                        <a:prstTxWarp prst="textNoShape">
+                          <a:avLst/>
+                        </a:prstTxWarp>
+                        <a:noAutofit/>
+                      </wps:bodyPr>
+                    </wps:wsp>
+                  </a:graphicData>
+                </a:graphic>
+                <wp14:sizeRelH relativeFrom="margin">
+                  <wp14:pctWidth>0</wp14:pctWidth>
+                </wp14:sizeRelH>
+                <wp14:sizeRelV relativeFrom="margin">
+                  <wp14:pctHeight>0</wp14:pctHeight>
+                </wp14:sizeRelV>
+              </wp:anchor>
+            </w:drawing>
+          </mc:Choice>
+          <mc:Fallback>
+            <w:pict>
+              <v:rect w14:anchorId="7D632F2D" id="Rectangle 2" o:spid="_x0000_s1027" style="position:absolute;margin-left:0;margin-top:-3pt;width:341.25pt;height:137.25pt;z-index:251660288;visibility:visible;mso-wrap-style:square;mso-width-percent:0;mso-height-percent:0;mso-wrap-distance-left:9pt;mso-wrap-distance-top:0;mso-wrap-distance-right:9pt;mso-wrap-distance-bottom:0;mso-position-horizontal:left;mso-position-horizontal-relative:margin;mso-position-vertical:absolute;mso-position-vertical-relative:text;mso-width-percent:0;mso-height-percent:0;mso-width-relative:margin;mso-height-relative:margin;v-text-anchor:middle" o:gfxdata="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" fillcolor="black [3200]" strokecolor="black [480]" strokeweight="1pt">
+                <v:textbox>
+                  <w:txbxContent>
+                    <w:p>
+                      <w:pPr>
+                        <w:spacing w:after="0"/>
+                        <w:rPr>
+                          <w:rFonts w:asciiTheme="majorBidi" w:hAnsiTheme="majorBidi" w:cstheme="majorBidi"/>
+                          <w:b/>
+                          <w:bCs/>
+                          <w:i/>
+                          <w:iCs/>
+                          <w:sz w:val="28"/>
+                          <w:szCs w:val="28"/>
+                        </w:rPr>
+                      </w:pPr>
+                      <w:proofErr w:type="spellStart"/>
+                      <w:r>
+                        <w:rPr>
+                          <w:rFonts w:asciiTheme="majorBidi" w:hAnsiTheme="majorBidi" w:cstheme="majorBidi"/>
+                          <w:b/>
+                          <w:bCs/>
+                          <w:i/>
+                          <w:iCs/>
+                          <w:sz w:val="28"/>
+                          <w:szCs w:val="28"/>
+                        </w:rPr>
+                        <w:t>become_method</w:t>
+                      </w:r>
+                      <w:proofErr w:type="spellEnd"/>
+                      <w:r>
+                        <w:rPr>
+                          <w:rFonts w:asciiTheme="majorBidi" w:hAnsiTheme="majorBidi" w:cstheme="majorBidi"/>
+                          <w:b/>
+                          <w:bCs/>
+                          <w:i/>
+                          <w:iCs/>
+                          <w:sz w:val="28"/>
+                          <w:szCs w:val="28"/>
+                        </w:rPr>
+                        <w:t xml:space="preserve"> = </w:t>
+                      </w:r>
+                      <w:proofErr w:type="spellStart"/>
+                      <w:r>
+                        <w:rPr>
+                          <w:rFonts w:asciiTheme="majorBidi" w:hAnsiTheme="majorBidi" w:cstheme="majorBidi"/>
+                          <w:b/>
+                          <w:bCs/>
+                          <w:i/>
+                          <w:iCs/>
+                          <w:sz w:val="28"/>
+                          <w:szCs w:val="28"/>
+                        </w:rPr>
+                        <w:t>sudo</w:t>
+                      </w:r>
+                      <w:proofErr w:type="spellEnd"/>
+                    </w:p>
+                    <w:p>
+                      <w:pPr>
+                        <w:spacing w:after="0"/>
+                        <w:rPr>
+                          <w:rFonts w:asciiTheme="majorBidi" w:hAnsiTheme="majorBidi" w:cstheme="majorBidi"/>
+                          <w:b/>
+                          <w:bCs/>
+                          <w:i/>
+                          <w:iCs/>
+                          <w:sz w:val="28"/>
+                          <w:szCs w:val="28"/>
+                        </w:rPr>
+                      </w:pPr>
+                      <w:proofErr w:type="spellStart"/>
+                      <w:r>
+                        <w:rPr>
+                          <w:rFonts w:asciiTheme="majorBidi" w:hAnsiTheme="majorBidi" w:cstheme="majorBidi"/>
+                          <w:b/>
+                          <w:bCs/>
+                          <w:i/>
+                          <w:iCs/>
+                          <w:sz w:val="28"/>
+                          <w:szCs w:val="28"/>
+                        </w:rPr>
+                        <w:t>become_user</w:t>
+                      </w:r>
+                      <w:proofErr w:type="spellEnd"/>
+                      <w:r>
+                        <w:rPr>
+                          <w:rFonts w:asciiTheme="majorBidi" w:hAnsiTheme="majorBidi" w:cstheme="majorBidi"/>
+                          <w:b/>
+                          <w:bCs/>
+                          <w:i/>
+                          <w:iCs/>
+                          <w:sz w:val="28"/>
+                          <w:szCs w:val="28"/>
+                        </w:rPr>
+                        <w:t xml:space="preserve"> = root</w:t>
+                      </w:r>
+                    </w:p>
+                    <w:p>
+                      <w:pPr>
+                        <w:spacing w:after="120"/>
+                        <w:rPr>
+                          <w:rFonts w:asciiTheme="majorBidi" w:hAnsiTheme="majorBidi" w:cstheme="majorBidi"/>
+                          <w:b/>
+                          <w:bCs/>
+                          <w:i/>
+                          <w:iCs/>
+                          <w:sz w:val="28"/>
+                          <w:szCs w:val="28"/>
+                        </w:rPr>
+                      </w:pPr>
+                      <w:proofErr w:type="spellStart"/>
+                      <w:r>
+                        <w:rPr>
+                          <w:rFonts w:asciiTheme="majorBidi" w:hAnsiTheme="majorBidi" w:cstheme="majorBidi"/>
+                          <w:b/>
+                          <w:bCs/>
+                          <w:i/>
+                          <w:iCs/>
+                          <w:sz w:val="28"/>
+                          <w:szCs w:val="28"/>
+                        </w:rPr>
+                        <w:t>become_ask_pass</w:t>
+                      </w:r>
+                      <w:proofErr w:type="spellEnd"/>
+                      <w:r>
+                        <w:rPr>
+                          <w:rFonts w:asciiTheme="majorBidi" w:hAnsiTheme="majorBidi" w:cstheme="majorBidi"/>
+                          <w:b/>
+                          <w:bCs/>
+                          <w:i/>
+                          <w:iCs/>
+                          <w:sz w:val="28"/>
+                          <w:szCs w:val="28"/>
+                        </w:rPr>
+                        <w:t xml:space="preserve"> = False</w:t>
+                      </w:r>
+                    </w:p>
+                    <w:p>
+                      <w:pPr>
+                        <w:spacing w:after="0"/>
+                        <w:rPr>
+                          <w:rFonts w:asciiTheme="majorBidi" w:hAnsiTheme="majorBidi" w:cstheme="majorBidi"/>
+                          <w:b/>
+                          <w:bCs/>
+                          <w:i/>
+                          <w:iCs/>
+                          <w:sz w:val="28"/>
+                          <w:szCs w:val="28"/>
+                        </w:rPr>
+                      </w:pPr>
+                      <w:r>
+                        <w:rPr>
+                          <w:rFonts w:asciiTheme="majorBidi" w:hAnsiTheme="majorBidi" w:cstheme="majorBidi"/>
+                          <w:b/>
+                          <w:bCs/>
+                          <w:i/>
+                          <w:iCs/>
+                          <w:sz w:val="28"/>
+                          <w:szCs w:val="28"/>
+                        </w:rPr>
+                        <w:t>[</w:t>
+                      </w:r>
+                      <w:proofErr w:type="spellStart"/>
+                      <w:r>
+                        <w:rPr>
+                          <w:rFonts w:asciiTheme="majorBidi" w:hAnsiTheme="majorBidi" w:cstheme="majorBidi"/>
+                          <w:b/>
+                          <w:bCs/>
+                          <w:i/>
+                          <w:iCs/>
+                          <w:sz w:val="28"/>
+                          <w:szCs w:val="28"/>
+                        </w:rPr>
+                        <w:t>ssh_connection</w:t>
+                      </w:r>
+                      <w:proofErr w:type="spellEnd"/>
+                      <w:r>
+                        <w:rPr>
+                          <w:rFonts w:asciiTheme="majorBidi" w:hAnsiTheme="majorBidi" w:cstheme="majorBidi"/>
+                          <w:b/>
+                          <w:bCs/>
+                          <w:i/>
+                          <w:iCs/>
+                          <w:sz w:val="28"/>
+                          <w:szCs w:val="28"/>
+                        </w:rPr>
+                        <w:t>]</w:t>
+                      </w:r>
+                    </w:p>
+                    <w:p>
+                      <w:pPr>
+                        <w:spacing w:after="0"/>
+                        <w:rPr>
+                          <w:rFonts w:asciiTheme="majorBidi" w:hAnsiTheme="majorBidi" w:cstheme="majorBidi"/>
+                          <w:b/>
+                          <w:bCs/>
+                          <w:i/>
+                          <w:iCs/>
+                          <w:color w:val="808080" w:themeColor="background1" w:themeShade="80"/>
+                          <w:sz w:val="28"/>
+                          <w:szCs w:val="28"/>
+                        </w:rPr>
+                      </w:pPr>
+                      <w:r>
+                        <w:rPr>
+                          <w:rFonts w:asciiTheme="majorBidi" w:hAnsiTheme="majorBidi" w:cstheme="majorBidi"/>
+                          <w:b/>
+                          <w:bCs/>
+                          <w:i/>
+                          <w:iCs/>
+                          <w:color w:val="808080" w:themeColor="background1" w:themeShade="80"/>
+                          <w:sz w:val="28"/>
+                          <w:szCs w:val="28"/>
+                        </w:rPr>
+                        <w:t># Huge performance boost</w:t>
+                      </w:r>
+                    </w:p>
+                    <w:p>
+                      <w:pPr>
+                        <w:spacing w:after="0"/>
+                        <w:rPr>
+                          <w:rFonts w:asciiTheme="majorBidi" w:hAnsiTheme="majorBidi" w:cstheme="majorBidi"/>
+                          <w:b/>
+                          <w:bCs/>
+                          <w:i/>
+                          <w:iCs/>
+                          <w:sz w:val="28"/>
+                          <w:szCs w:val="28"/>
+                        </w:rPr>
+                      </w:pPr>
+                      <w:r>
+                        <w:rPr>
+                          <w:rFonts w:asciiTheme="majorBidi" w:hAnsiTheme="majorBidi" w:cstheme="majorBidi"/>
+                          <w:b/>
+                          <w:bCs/>
+                          <w:i/>
+                          <w:iCs/>
+                          <w:sz w:val="28"/>
+                          <w:szCs w:val="28"/>
+                        </w:rPr>
+                        <w:t>pipelining = True</w:t>
+                      </w:r>
+                    </w:p>
+                    <w:p>
+                      <w:pPr>
+                        <w:jc w:val="both"/>
+                        <w:rPr>
+                          <w:rFonts w:asciiTheme="majorBidi" w:hAnsiTheme="majorBidi" w:cstheme="majorBidi"/>
+                          <w:b/>
+                          <w:bCs/>
+                          <w:i/>
+                          <w:iCs/>
+                          <w:sz w:val="28"/>
+                          <w:szCs w:val="28"/>
+                        </w:rPr>
+                      </w:pPr>
+                      <w:proofErr w:type="spellStart"/>
+                      <w:r>
+                        <w:rPr>
+                          <w:rFonts w:asciiTheme="majorBidi" w:hAnsiTheme="majorBidi" w:cstheme="majorBidi"/>
+                          <w:b/>
+                          <w:bCs/>
+                          <w:i/>
+                          <w:iCs/>
+                          <w:sz w:val="28"/>
+                          <w:szCs w:val="28"/>
+                        </w:rPr>
+                        <w:t>ssh_args</w:t>
+                      </w:r>
+                      <w:proofErr w:type="spellEnd"/>
+                      <w:r>
+                        <w:rPr>
+                          <w:rFonts w:asciiTheme="majorBidi" w:hAnsiTheme="majorBidi" w:cstheme="majorBidi"/>
+                          <w:b/>
+                          <w:bCs/>
+                          <w:i/>
+                          <w:iCs/>
+                          <w:sz w:val="28"/>
+                          <w:szCs w:val="28"/>
+                        </w:rPr>
+                        <w:t xml:space="preserve"> = -o </w:t>
+                      </w:r>
+                      <w:proofErr w:type="spellStart"/>
+                      <w:r>
+                        <w:rPr>
+                          <w:rFonts w:asciiTheme="majorBidi" w:hAnsiTheme="majorBidi" w:cstheme="majorBidi"/>
+                          <w:b/>
+                          <w:bCs/>
+                          <w:i/>
+                          <w:iCs/>
+                          <w:sz w:val="28"/>
+                          <w:szCs w:val="28"/>
+                        </w:rPr>
+                        <w:t>ControlMaster</w:t>
+                      </w:r>
+                      <w:proofErr w:type="spellEnd"/>
+                      <w:r>
+                        <w:rPr>
+                          <w:rFonts w:asciiTheme="majorBidi" w:hAnsiTheme="majorBidi" w:cstheme="majorBidi"/>
+                          <w:b/>
+                          <w:bCs/>
+                          <w:i/>
+                          <w:iCs/>
+                          <w:sz w:val="28"/>
+                          <w:szCs w:val="28"/>
+                        </w:rPr>
+                        <w:t xml:space="preserve">=auto -o </w:t>
+                      </w:r>
+                      <w:proofErr w:type="spellStart"/>
+                      <w:r>
+                        <w:rPr>
+                          <w:rFonts w:asciiTheme="majorBidi" w:hAnsiTheme="majorBidi" w:cstheme="majorBidi"/>
+                          <w:b/>
+                          <w:bCs/>
+                          <w:i/>
+                          <w:iCs/>
+                          <w:sz w:val="28"/>
+                          <w:szCs w:val="28"/>
+                        </w:rPr>
+                        <w:t>ControlPersist</w:t>
+                      </w:r>
+                      <w:proofErr w:type="spellEnd"/>
+                      <w:r>
+                        <w:rPr>
+                          <w:rFonts w:asciiTheme="majorBidi" w:hAnsiTheme="majorBidi" w:cstheme="majorBidi"/>
+                          <w:b/>
+                          <w:bCs/>
+                          <w:i/>
+                          <w:iCs/>
+                          <w:sz w:val="28"/>
+                          <w:szCs w:val="28"/>
+                        </w:rPr>
+                        <w:t>=60s</w:t>
+                      </w:r>
+                    </w:p>
+                    <w:p>
+                      <w:pPr>
+                        <w:jc w:val="center"/>
+                      </w:pPr>
+                    </w:p>
+                  </w:txbxContent>
+                </v:textbox>
+                <w10:wrap anchorx="margin"/>
+              </v:rect>
+            </w:pict>
+          </mc:Fallback>
+        </mc:AlternateContent>
+      </w:r>
     </w:p>
     <w:p>
       <w:pPr>
@@ -3805,8 +4174,8 @@
       <w:pPr>
         <w:rPr>
           <w:rFonts w:asciiTheme="majorBidi" w:hAnsiTheme="majorBidi" w:cstheme="majorBidi"/>
-          <w:sz w:val="2"/>
-          <w:szCs w:val="2"/>
+          <w:sz w:val="4"/>
+          <w:szCs w:val="4"/>
         </w:rPr>
       </w:pPr>
     </w:p>
@@ -3923,7 +4292,6 @@
           <w:sz w:val="28"/>
           <w:szCs w:val="28"/>
         </w:rPr>
-        <w:lastRenderedPageBreak/>
         <w:t>Use Relative Paths</w:t>
       </w:r>
       <w:r>
@@ -4304,6 +4672,119 @@
 <file path=word/numbering.xml><?xml version="1.0" encoding="utf-8"?>
 <w:numbering xmlns:wpc="http://schemas.microsoft.com/office/word/2010/wordprocessingCanvas" xmlns:cx="http://schemas.microsoft.com/office/drawing/2014/chartex" xmlns:cx1="http://schemas.microsoft.com/office/drawing/2015/9/8/chartex" xmlns:cx2="http://schemas.microsoft.com/office/drawing/2015/10/21/chartex" xmlns:cx3="http://schemas.microsoft.com/office/drawing/2016/5/9/chartex" xmlns:cx4="http://schemas.microsoft.com/office/drawing/2016/5/10/chartex" xmlns:cx5="http://schemas.microsoft.com/office/drawing/2016/5/11/chartex" xmlns:cx6="http://schemas.microsoft.com/office/drawing/2016/5/12/chartex" xmlns:cx7="http://schemas.microsoft.com/office/drawing/2016/5/13/chartex" xmlns:cx8="http://schemas.microsoft.com/office/drawing/2016/5/14/chartex" xmlns:mc="http://schemas.openxmlformats.org/markup-compatibility/2006" xmlns:aink="http://schemas.microsoft.com/office/drawing/2016/ink" xmlns:am3d="http://schemas.microsoft.com/office/drawing/2017/model3d" xmlns:o="urn:schemas-microsoft-com:office:office" xmlns:oel="http://schemas.microsoft.com/office/2019/extlst" xmlns:r="http://schemas.openxmlformats.org/officeDocument/2006/relationships" xmlns:m="http://schemas.openxmlformats.org/officeDocument/2006/math" xmlns:v="urn:schemas-microsoft-com:vml" xmlns:wp14="http://schemas.microsoft.com/office/word/2010/wordprocessingDrawing" xmlns:wp="http://schemas.openxmlformats.org/drawingml/2006/wordprocessingDrawing" xmlns:w10="urn:schemas-microsoft-com:office:word" xmlns:w="http://schemas.openxmlformats.org/wordprocessingml/2006/main" xmlns:w14="http://schemas.microsoft.com/office/word/2010/wordml" xmlns:w15="http://schemas.microsoft.com/office/word/2012/wordml" xmlns:w16cex="http://schemas.microsoft.com/office/word/2018/wordml/cex" xmlns:w16cid="http://schemas.microsoft.com/office/word/2016/wordml/cid" xmlns:w16="http://schemas.microsoft.com/office/word/2018/wordml" xmlns:w16sdtdh="http://schemas.microsoft.com/office/word/2020/wordml/sdtdatahash" xmlns:w16se="http://schemas.microsoft.com/office/word/2015/wordml/symex" xmlns:wpg="http://schemas.microsoft.com/office/word/2010/wordprocessingGroup" xmlns:wpi="http://schemas.microsoft.com/office/word/2010/wordprocessingInk" xmlns:wne="http://schemas.microsoft.com/office/word/2006/wordml" xmlns:wps="http://schemas.microsoft.com/office/word/2010/wordprocessingShape" mc:Ignorable="w14 w15 w16se w16cid w16 w16cex w16sdtdh wp14">
   <w:abstractNum w:abstractNumId="0" w15:restartNumberingAfterBreak="0">
+    <w:nsid w:val="17635839"/>
+    <w:multiLevelType w:val="hybridMultilevel"/>
+    <w:tmpl w:val="B47814C6"/>
+    <w:lvl w:ilvl="0" w:tplc="04090003">
+      <w:start w:val="1"/>
+      <w:numFmt w:val="bullet"/>
+      <w:lvlText w:val="o"/>
+      <w:lvlJc w:val="left"/>
+      <w:pPr>
+        <w:ind w:left="1080" w:hanging="360"/>
+      </w:pPr>
+      <w:rPr>
+        <w:rFonts w:ascii="Courier New" w:hAnsi="Courier New" w:cs="Courier New" w:hint="default"/>
+      </w:rPr>
+    </w:lvl>
+    <w:lvl w:ilvl="1" w:tplc="04090003" w:tentative="1">
+      <w:start w:val="1"/>
+      <w:numFmt w:val="bullet"/>
+      <w:lvlText w:val="o"/>
+      <w:lvlJc w:val="left"/>
+      <w:pPr>
+        <w:ind w:left="1800" w:hanging="360"/>
+      </w:pPr>
+      <w:rPr>
+        <w:rFonts w:ascii="Courier New" w:hAnsi="Courier New" w:cs="Courier New" w:hint="default"/>
+      </w:rPr>
+    </w:lvl>
+    <w:lvl w:ilvl="2" w:tplc="04090005" w:tentative="1">
+      <w:start w:val="1"/>
+      <w:numFmt w:val="bullet"/>
+      <w:lvlText w:val=""/>
+      <w:lvlJc w:val="left"/>
+      <w:pPr>
+        <w:ind w:left="2520" w:hanging="360"/>
+      </w:pPr>
+      <w:rPr>
+        <w:rFonts w:ascii="Wingdings" w:hAnsi="Wingdings" w:hint="default"/>
+      </w:rPr>
+    </w:lvl>
+    <w:lvl w:ilvl="3" w:tplc="04090001" w:tentative="1">
+      <w:start w:val="1"/>
+      <w:numFmt w:val="bullet"/>
+      <w:lvlText w:val=""/>
+      <w:lvlJc w:val="left"/>
+      <w:pPr>
+        <w:ind w:left="3240" w:hanging="360"/>
+      </w:pPr>
+      <w:rPr>
+        <w:rFonts w:ascii="Symbol" w:hAnsi="Symbol" w:hint="default"/>
+      </w:rPr>
+    </w:lvl>
+    <w:lvl w:ilvl="4" w:tplc="04090003" w:tentative="1">
+      <w:start w:val="1"/>
+      <w:numFmt w:val="bullet"/>
+      <w:lvlText w:val="o"/>
+      <w:lvlJc w:val="left"/>
+      <w:pPr>
+        <w:ind w:left="3960" w:hanging="360"/>
+      </w:pPr>
+      <w:rPr>
+        <w:rFonts w:ascii="Courier New" w:hAnsi="Courier New" w:cs="Courier New" w:hint="default"/>
+      </w:rPr>
+    </w:lvl>
+    <w:lvl w:ilvl="5" w:tplc="04090005" w:tentative="1">
+      <w:start w:val="1"/>
+      <w:numFmt w:val="bullet"/>
+      <w:lvlText w:val=""/>
+      <w:lvlJc w:val="left"/>
+      <w:pPr>
+        <w:ind w:left="4680" w:hanging="360"/>
+      </w:pPr>
+      <w:rPr>
+        <w:rFonts w:ascii="Wingdings" w:hAnsi="Wingdings" w:hint="default"/>
+      </w:rPr>
+    </w:lvl>
+    <w:lvl w:ilvl="6" w:tplc="04090001" w:tentative="1">
+      <w:start w:val="1"/>
+      <w:numFmt w:val="bullet"/>
+      <w:lvlText w:val=""/>
+      <w:lvlJc w:val="left"/>
+      <w:pPr>
+        <w:ind w:left="5400" w:hanging="360"/>
+      </w:pPr>
+      <w:rPr>
+        <w:rFonts w:ascii="Symbol" w:hAnsi="Symbol" w:hint="default"/>
+      </w:rPr>
+    </w:lvl>
+    <w:lvl w:ilvl="7" w:tplc="04090003" w:tentative="1">
+      <w:start w:val="1"/>
+      <w:numFmt w:val="bullet"/>
+      <w:lvlText w:val="o"/>
+      <w:lvlJc w:val="left"/>
+      <w:pPr>
+        <w:ind w:left="6120" w:hanging="360"/>
+      </w:pPr>
+      <w:rPr>
+        <w:rFonts w:ascii="Courier New" w:hAnsi="Courier New" w:cs="Courier New" w:hint="default"/>
+      </w:rPr>
+    </w:lvl>
+    <w:lvl w:ilvl="8" w:tplc="04090005" w:tentative="1">
+      <w:start w:val="1"/>
+      <w:numFmt w:val="bullet"/>
+      <w:lvlText w:val=""/>
+      <w:lvlJc w:val="left"/>
+      <w:pPr>
+        <w:ind w:left="6840" w:hanging="360"/>
+      </w:pPr>
+      <w:rPr>
+        <w:rFonts w:ascii="Wingdings" w:hAnsi="Wingdings" w:hint="default"/>
+      </w:rPr>
+    </w:lvl>
+  </w:abstractNum>
+  <w:abstractNum w:abstractNumId="1" w15:restartNumberingAfterBreak="0">
     <w:nsid w:val="35617FE6"/>
     <w:multiLevelType w:val="hybridMultilevel"/>
     <w:tmpl w:val="E5AE00C6"/>
@@ -4416,7 +4897,7 @@
       </w:rPr>
     </w:lvl>
   </w:abstractNum>
-  <w:abstractNum w:abstractNumId="1" w15:restartNumberingAfterBreak="0">
+  <w:abstractNum w:abstractNumId="2" w15:restartNumberingAfterBreak="0">
     <w:nsid w:val="3EDD6193"/>
     <w:multiLevelType w:val="hybridMultilevel"/>
     <w:tmpl w:val="096257D8"/>
@@ -4502,7 +4983,7 @@
       </w:pPr>
     </w:lvl>
   </w:abstractNum>
-  <w:abstractNum w:abstractNumId="2" w15:restartNumberingAfterBreak="0">
+  <w:abstractNum w:abstractNumId="3" w15:restartNumberingAfterBreak="0">
     <w:nsid w:val="567A5B6C"/>
     <w:multiLevelType w:val="hybridMultilevel"/>
     <w:tmpl w:val="2C5E938C"/>
@@ -4615,7 +5096,7 @@
       </w:rPr>
     </w:lvl>
   </w:abstractNum>
-  <w:abstractNum w:abstractNumId="3" w15:restartNumberingAfterBreak="0">
+  <w:abstractNum w:abstractNumId="4" w15:restartNumberingAfterBreak="0">
     <w:nsid w:val="583828C7"/>
     <w:multiLevelType w:val="hybridMultilevel"/>
     <w:tmpl w:val="AB1283AA"/>
@@ -4728,7 +5209,7 @@
       </w:rPr>
     </w:lvl>
   </w:abstractNum>
-  <w:abstractNum w:abstractNumId="4" w15:restartNumberingAfterBreak="0">
+  <w:abstractNum w:abstractNumId="5" w15:restartNumberingAfterBreak="0">
     <w:nsid w:val="58EC2BAA"/>
     <w:multiLevelType w:val="hybridMultilevel"/>
     <w:tmpl w:val="A784E26E"/>
@@ -4841,7 +5322,120 @@
       </w:rPr>
     </w:lvl>
   </w:abstractNum>
-  <w:abstractNum w:abstractNumId="5" w15:restartNumberingAfterBreak="0">
+  <w:abstractNum w:abstractNumId="6" w15:restartNumberingAfterBreak="0">
+    <w:nsid w:val="5C9E55B3"/>
+    <w:multiLevelType w:val="hybridMultilevel"/>
+    <w:tmpl w:val="EB2456EA"/>
+    <w:lvl w:ilvl="0" w:tplc="04090001">
+      <w:start w:val="1"/>
+      <w:numFmt w:val="bullet"/>
+      <w:lvlText w:val=""/>
+      <w:lvlJc w:val="left"/>
+      <w:pPr>
+        <w:ind w:left="1080" w:hanging="360"/>
+      </w:pPr>
+      <w:rPr>
+        <w:rFonts w:ascii="Symbol" w:hAnsi="Symbol" w:hint="default"/>
+      </w:rPr>
+    </w:lvl>
+    <w:lvl w:ilvl="1" w:tplc="04090003" w:tentative="1">
+      <w:start w:val="1"/>
+      <w:numFmt w:val="bullet"/>
+      <w:lvlText w:val="o"/>
+      <w:lvlJc w:val="left"/>
+      <w:pPr>
+        <w:ind w:left="1800" w:hanging="360"/>
+      </w:pPr>
+      <w:rPr>
+        <w:rFonts w:ascii="Courier New" w:hAnsi="Courier New" w:cs="Courier New" w:hint="default"/>
+      </w:rPr>
+    </w:lvl>
+    <w:lvl w:ilvl="2" w:tplc="04090005" w:tentative="1">
+      <w:start w:val="1"/>
+      <w:numFmt w:val="bullet"/>
+      <w:lvlText w:val=""/>
+      <w:lvlJc w:val="left"/>
+      <w:pPr>
+        <w:ind w:left="2520" w:hanging="360"/>
+      </w:pPr>
+      <w:rPr>
+        <w:rFonts w:ascii="Wingdings" w:hAnsi="Wingdings" w:hint="default"/>
+      </w:rPr>
+    </w:lvl>
+    <w:lvl w:ilvl="3" w:tplc="04090001" w:tentative="1">
+      <w:start w:val="1"/>
+      <w:numFmt w:val="bullet"/>
+      <w:lvlText w:val=""/>
+      <w:lvlJc w:val="left"/>
+      <w:pPr>
+        <w:ind w:left="3240" w:hanging="360"/>
+      </w:pPr>
+      <w:rPr>
+        <w:rFonts w:ascii="Symbol" w:hAnsi="Symbol" w:hint="default"/>
+      </w:rPr>
+    </w:lvl>
+    <w:lvl w:ilvl="4" w:tplc="04090003" w:tentative="1">
+      <w:start w:val="1"/>
+      <w:numFmt w:val="bullet"/>
+      <w:lvlText w:val="o"/>
+      <w:lvlJc w:val="left"/>
+      <w:pPr>
+        <w:ind w:left="3960" w:hanging="360"/>
+      </w:pPr>
+      <w:rPr>
+        <w:rFonts w:ascii="Courier New" w:hAnsi="Courier New" w:cs="Courier New" w:hint="default"/>
+      </w:rPr>
+    </w:lvl>
+    <w:lvl w:ilvl="5" w:tplc="04090005" w:tentative="1">
+      <w:start w:val="1"/>
+      <w:numFmt w:val="bullet"/>
+      <w:lvlText w:val=""/>
+      <w:lvlJc w:val="left"/>
+      <w:pPr>
+        <w:ind w:left="4680" w:hanging="360"/>
+      </w:pPr>
+      <w:rPr>
+        <w:rFonts w:ascii="Wingdings" w:hAnsi="Wingdings" w:hint="default"/>
+      </w:rPr>
+    </w:lvl>
+    <w:lvl w:ilvl="6" w:tplc="04090001" w:tentative="1">
+      <w:start w:val="1"/>
+      <w:numFmt w:val="bullet"/>
+      <w:lvlText w:val=""/>
+      <w:lvlJc w:val="left"/>
+      <w:pPr>
+        <w:ind w:left="5400" w:hanging="360"/>
+      </w:pPr>
+      <w:rPr>
+        <w:rFonts w:ascii="Symbol" w:hAnsi="Symbol" w:hint="default"/>
+      </w:rPr>
+    </w:lvl>
+    <w:lvl w:ilvl="7" w:tplc="04090003" w:tentative="1">
+      <w:start w:val="1"/>
+      <w:numFmt w:val="bullet"/>
+      <w:lvlText w:val="o"/>
+      <w:lvlJc w:val="left"/>
+      <w:pPr>
+        <w:ind w:left="6120" w:hanging="360"/>
+      </w:pPr>
+      <w:rPr>
+        <w:rFonts w:ascii="Courier New" w:hAnsi="Courier New" w:cs="Courier New" w:hint="default"/>
+      </w:rPr>
+    </w:lvl>
+    <w:lvl w:ilvl="8" w:tplc="04090005" w:tentative="1">
+      <w:start w:val="1"/>
+      <w:numFmt w:val="bullet"/>
+      <w:lvlText w:val=""/>
+      <w:lvlJc w:val="left"/>
+      <w:pPr>
+        <w:ind w:left="6840" w:hanging="360"/>
+      </w:pPr>
+      <w:rPr>
+        <w:rFonts w:ascii="Wingdings" w:hAnsi="Wingdings" w:hint="default"/>
+      </w:rPr>
+    </w:lvl>
+  </w:abstractNum>
+  <w:abstractNum w:abstractNumId="7" w15:restartNumberingAfterBreak="0">
     <w:nsid w:val="5EE712B3"/>
     <w:multiLevelType w:val="hybridMultilevel"/>
     <w:tmpl w:val="D45ED692"/>
@@ -4954,7 +5548,7 @@
       </w:rPr>
     </w:lvl>
   </w:abstractNum>
-  <w:abstractNum w:abstractNumId="6" w15:restartNumberingAfterBreak="0">
+  <w:abstractNum w:abstractNumId="8" w15:restartNumberingAfterBreak="0">
     <w:nsid w:val="61FA0B9C"/>
     <w:multiLevelType w:val="hybridMultilevel"/>
     <w:tmpl w:val="D4CE6546"/>
@@ -5067,7 +5661,120 @@
       </w:rPr>
     </w:lvl>
   </w:abstractNum>
-  <w:abstractNum w:abstractNumId="7" w15:restartNumberingAfterBreak="0">
+  <w:abstractNum w:abstractNumId="9" w15:restartNumberingAfterBreak="0">
+    <w:nsid w:val="75FB6397"/>
+    <w:multiLevelType w:val="hybridMultilevel"/>
+    <w:tmpl w:val="DD12B50E"/>
+    <w:lvl w:ilvl="0" w:tplc="04090003">
+      <w:start w:val="1"/>
+      <w:numFmt w:val="bullet"/>
+      <w:lvlText w:val="o"/>
+      <w:lvlJc w:val="left"/>
+      <w:pPr>
+        <w:ind w:left="720" w:hanging="360"/>
+      </w:pPr>
+      <w:rPr>
+        <w:rFonts w:ascii="Courier New" w:hAnsi="Courier New" w:cs="Courier New" w:hint="default"/>
+      </w:rPr>
+    </w:lvl>
+    <w:lvl w:ilvl="1" w:tplc="04090003" w:tentative="1">
+      <w:start w:val="1"/>
+      <w:numFmt w:val="bullet"/>
+      <w:lvlText w:val="o"/>
+      <w:lvlJc w:val="left"/>
+      <w:pPr>
+        <w:ind w:left="1440" w:hanging="360"/>
+      </w:pPr>
+      <w:rPr>
+        <w:rFonts w:ascii="Courier New" w:hAnsi="Courier New" w:cs="Courier New" w:hint="default"/>
+      </w:rPr>
+    </w:lvl>
+    <w:lvl w:ilvl="2" w:tplc="04090005" w:tentative="1">
+      <w:start w:val="1"/>
+      <w:numFmt w:val="bullet"/>
+      <w:lvlText w:val=""/>
+      <w:lvlJc w:val="left"/>
+      <w:pPr>
+        <w:ind w:left="2160" w:hanging="360"/>
+      </w:pPr>
+      <w:rPr>
+        <w:rFonts w:ascii="Wingdings" w:hAnsi="Wingdings" w:hint="default"/>
+      </w:rPr>
+    </w:lvl>
+    <w:lvl w:ilvl="3" w:tplc="04090001" w:tentative="1">
+      <w:start w:val="1"/>
+      <w:numFmt w:val="bullet"/>
+      <w:lvlText w:val=""/>
+      <w:lvlJc w:val="left"/>
+      <w:pPr>
+        <w:ind w:left="2880" w:hanging="360"/>
+      </w:pPr>
+      <w:rPr>
+        <w:rFonts w:ascii="Symbol" w:hAnsi="Symbol" w:hint="default"/>
+      </w:rPr>
+    </w:lvl>
+    <w:lvl w:ilvl="4" w:tplc="04090003" w:tentative="1">
+      <w:start w:val="1"/>
+      <w:numFmt w:val="bullet"/>
+      <w:lvlText w:val="o"/>
+      <w:lvlJc w:val="left"/>
+      <w:pPr>
+        <w:ind w:left="3600" w:hanging="360"/>
+      </w:pPr>
+      <w:rPr>
+        <w:rFonts w:ascii="Courier New" w:hAnsi="Courier New" w:cs="Courier New" w:hint="default"/>
+      </w:rPr>
+    </w:lvl>
+    <w:lvl w:ilvl="5" w:tplc="04090005" w:tentative="1">
+      <w:start w:val="1"/>
+      <w:numFmt w:val="bullet"/>
+      <w:lvlText w:val=""/>
+      <w:lvlJc w:val="left"/>
+      <w:pPr>
+        <w:ind w:left="4320" w:hanging="360"/>
+      </w:pPr>
+      <w:rPr>
+        <w:rFonts w:ascii="Wingdings" w:hAnsi="Wingdings" w:hint="default"/>
+      </w:rPr>
+    </w:lvl>
+    <w:lvl w:ilvl="6" w:tplc="04090001" w:tentative="1">
+      <w:start w:val="1"/>
+      <w:numFmt w:val="bullet"/>
+      <w:lvlText w:val=""/>
+      <w:lvlJc w:val="left"/>
+      <w:pPr>
+        <w:ind w:left="5040" w:hanging="360"/>
+      </w:pPr>
+      <w:rPr>
+        <w:rFonts w:ascii="Symbol" w:hAnsi="Symbol" w:hint="default"/>
+      </w:rPr>
+    </w:lvl>
+    <w:lvl w:ilvl="7" w:tplc="04090003" w:tentative="1">
+      <w:start w:val="1"/>
+      <w:numFmt w:val="bullet"/>
+      <w:lvlText w:val="o"/>
+      <w:lvlJc w:val="left"/>
+      <w:pPr>
+        <w:ind w:left="5760" w:hanging="360"/>
+      </w:pPr>
+      <w:rPr>
+        <w:rFonts w:ascii="Courier New" w:hAnsi="Courier New" w:cs="Courier New" w:hint="default"/>
+      </w:rPr>
+    </w:lvl>
+    <w:lvl w:ilvl="8" w:tplc="04090005" w:tentative="1">
+      <w:start w:val="1"/>
+      <w:numFmt w:val="bullet"/>
+      <w:lvlText w:val=""/>
+      <w:lvlJc w:val="left"/>
+      <w:pPr>
+        <w:ind w:left="6480" w:hanging="360"/>
+      </w:pPr>
+      <w:rPr>
+        <w:rFonts w:ascii="Wingdings" w:hAnsi="Wingdings" w:hint="default"/>
+      </w:rPr>
+    </w:lvl>
+  </w:abstractNum>
+  <w:abstractNum w:abstractNumId="10" w15:restartNumberingAfterBreak="0">
     <w:nsid w:val="7EA72FFE"/>
     <w:multiLevelType w:val="hybridMultilevel"/>
     <w:tmpl w:val="EF145360"/>
@@ -5181,28 +5888,37 @@
     </w:lvl>
   </w:abstractNum>
   <w:num w:numId="1" w16cid:durableId="519046465">
+    <w:abstractNumId w:val="2"/>
+  </w:num>
+  <w:num w:numId="2" w16cid:durableId="310838524">
+    <w:abstractNumId w:val="3"/>
+  </w:num>
+  <w:num w:numId="3" w16cid:durableId="1729573322">
+    <w:abstractNumId w:val="5"/>
+  </w:num>
+  <w:num w:numId="4" w16cid:durableId="1969118186">
+    <w:abstractNumId w:val="8"/>
+  </w:num>
+  <w:num w:numId="5" w16cid:durableId="70658062">
+    <w:abstractNumId w:val="4"/>
+  </w:num>
+  <w:num w:numId="6" w16cid:durableId="1006592507">
     <w:abstractNumId w:val="1"/>
   </w:num>
-  <w:num w:numId="2" w16cid:durableId="310838524">
-    <w:abstractNumId w:val="2"/>
+  <w:num w:numId="7" w16cid:durableId="713889646">
+    <w:abstractNumId w:val="10"/>
   </w:num>
-  <w:num w:numId="3" w16cid:durableId="1729573322">
-    <w:abstractNumId w:val="4"/>
+  <w:num w:numId="8" w16cid:durableId="338048763">
+    <w:abstractNumId w:val="7"/>
   </w:num>
-  <w:num w:numId="4" w16cid:durableId="1969118186">
+  <w:num w:numId="9" w16cid:durableId="861868450">
+    <w:abstractNumId w:val="0"/>
+  </w:num>
+  <w:num w:numId="10" w16cid:durableId="892280168">
     <w:abstractNumId w:val="6"/>
   </w:num>
-  <w:num w:numId="5" w16cid:durableId="70658062">
-    <w:abstractNumId w:val="3"/>
-  </w:num>
-  <w:num w:numId="6" w16cid:durableId="1006592507">
-    <w:abstractNumId w:val="0"/>
-  </w:num>
-  <w:num w:numId="7" w16cid:durableId="713889646">
-    <w:abstractNumId w:val="7"/>
-  </w:num>
-  <w:num w:numId="8" w16cid:durableId="338048763">
-    <w:abstractNumId w:val="5"/>
+  <w:num w:numId="11" w16cid:durableId="437139795">
+    <w:abstractNumId w:val="9"/>
   </w:num>
 </w:numbering>
 </file>

</xml_diff>